<commit_message>
Mise à jour rapport
</commit_message>
<xml_diff>
--- a/Projet Jeu Java.docx
+++ b/Projet Jeu Java.docx
@@ -401,14 +401,1087 @@
     </w:p>
     <w:p>
       <w:pPr>
+        <w:pStyle w:val="Heading1"/>
+        <w:rPr>
+          <w:lang w:val="fr-FR"/>
+        </w:rPr>
+      </w:pPr>
+      <w:r>
+        <w:rPr>
+          <w:lang w:val="fr-FR"/>
+        </w:rPr>
+        <w:lastRenderedPageBreak/>
+        <w:t>Sommaire</w:t>
+      </w:r>
+      <w:r>
+        <w:rPr>
+          <w:lang w:val="fr-FR"/>
+        </w:rPr>
+        <w:t xml:space="preserve"> : </w:t>
+      </w:r>
+    </w:p>
+    <w:p>
+      <w:pPr>
         <w:rPr>
           <w:rFonts w:ascii="Segoe UI" w:hAnsi="Segoe UI" w:cs="Segoe UI"/>
-          <w:sz w:val="44"/>
-          <w:szCs w:val="44"/>
-          <w:lang w:val="fr-FR"/>
-        </w:rPr>
-      </w:pPr>
-      <w:r>
+          <w:sz w:val="36"/>
+          <w:szCs w:val="36"/>
+          <w:lang w:val="fr-FR"/>
+        </w:rPr>
+      </w:pPr>
+    </w:p>
+    <w:p>
+      <w:pPr>
+        <w:pStyle w:val="Heading2"/>
+      </w:pPr>
+      <w:r>
+        <w:rPr>
+          <w:lang w:val="fr-FR"/>
+        </w:rPr>
+        <w:t>Chapitre</w:t>
+      </w:r>
+      <w:r>
+        <w:t xml:space="preserve"> 1 : Introduction Géné</w:t>
+      </w:r>
+      <w:r>
+        <w:t>rale</w:t>
+      </w:r>
+      <w:r>
+        <w:t>.</w:t>
+      </w:r>
+    </w:p>
+    <w:p>
+      <w:pPr>
+        <w:pStyle w:val="ListParagraph"/>
+        <w:numPr>
+          <w:ilvl w:val="0"/>
+          <w:numId w:val="8"/>
+        </w:numPr>
+        <w:rPr>
+          <w:rFonts w:ascii="Segoe UI" w:hAnsi="Segoe UI" w:cs="Segoe UI"/>
+          <w:sz w:val="28"/>
+          <w:szCs w:val="28"/>
+          <w:lang w:val="fr-FR"/>
+        </w:rPr>
+      </w:pPr>
+      <w:r>
+        <w:rPr>
+          <w:rFonts w:ascii="Segoe UI" w:hAnsi="Segoe UI" w:cs="Segoe UI"/>
+          <w:sz w:val="28"/>
+          <w:szCs w:val="28"/>
+          <w:lang w:val="fr-FR"/>
+        </w:rPr>
+        <w:t>R</w:t>
+      </w:r>
+      <w:r>
+        <w:rPr>
+          <w:rFonts w:ascii="Segoe UI" w:hAnsi="Segoe UI" w:cs="Segoe UI"/>
+          <w:sz w:val="28"/>
+          <w:szCs w:val="28"/>
+          <w:lang w:val="fr-FR"/>
+        </w:rPr>
+        <w:t>emercie</w:t>
+      </w:r>
+      <w:r>
+        <w:rPr>
+          <w:rFonts w:ascii="Segoe UI" w:hAnsi="Segoe UI" w:cs="Segoe UI"/>
+          <w:sz w:val="28"/>
+          <w:szCs w:val="28"/>
+          <w:lang w:val="fr-FR"/>
+        </w:rPr>
+        <w:t>ment</w:t>
+      </w:r>
+      <w:r>
+        <w:rPr>
+          <w:rFonts w:ascii="Segoe UI" w:hAnsi="Segoe UI" w:cs="Segoe UI"/>
+          <w:sz w:val="28"/>
+          <w:szCs w:val="28"/>
+          <w:lang w:val="fr-FR"/>
+        </w:rPr>
+        <w:t>.</w:t>
+      </w:r>
+    </w:p>
+    <w:p>
+      <w:pPr>
+        <w:pStyle w:val="ListParagraph"/>
+        <w:numPr>
+          <w:ilvl w:val="0"/>
+          <w:numId w:val="8"/>
+        </w:numPr>
+        <w:rPr>
+          <w:rFonts w:ascii="Segoe UI" w:hAnsi="Segoe UI" w:cs="Segoe UI"/>
+          <w:sz w:val="28"/>
+          <w:szCs w:val="28"/>
+          <w:lang w:val="fr-FR"/>
+        </w:rPr>
+      </w:pPr>
+      <w:r>
+        <w:rPr>
+          <w:rFonts w:ascii="Segoe UI" w:hAnsi="Segoe UI" w:cs="Segoe UI"/>
+          <w:sz w:val="28"/>
+          <w:szCs w:val="28"/>
+          <w:lang w:val="fr-FR"/>
+        </w:rPr>
+        <w:t>Résumé</w:t>
+      </w:r>
+      <w:r>
+        <w:rPr>
+          <w:rFonts w:ascii="Segoe UI" w:hAnsi="Segoe UI" w:cs="Segoe UI"/>
+          <w:sz w:val="28"/>
+          <w:szCs w:val="28"/>
+          <w:lang w:val="fr-FR"/>
+        </w:rPr>
+        <w:t>.</w:t>
+      </w:r>
+    </w:p>
+    <w:p>
+      <w:pPr>
+        <w:pStyle w:val="ListParagraph"/>
+        <w:numPr>
+          <w:ilvl w:val="0"/>
+          <w:numId w:val="8"/>
+        </w:numPr>
+        <w:rPr>
+          <w:rFonts w:ascii="Segoe UI" w:hAnsi="Segoe UI" w:cs="Segoe UI"/>
+          <w:sz w:val="28"/>
+          <w:szCs w:val="28"/>
+          <w:lang w:val="fr-FR"/>
+        </w:rPr>
+      </w:pPr>
+      <w:r>
+        <w:rPr>
+          <w:rFonts w:ascii="Segoe UI" w:hAnsi="Segoe UI" w:cs="Segoe UI"/>
+          <w:sz w:val="28"/>
+          <w:szCs w:val="28"/>
+          <w:lang w:val="fr-FR"/>
+        </w:rPr>
+        <w:t>Présentation du</w:t>
+      </w:r>
+      <w:r>
+        <w:rPr>
+          <w:rFonts w:ascii="Segoe UI" w:hAnsi="Segoe UI" w:cs="Segoe UI"/>
+          <w:sz w:val="28"/>
+          <w:szCs w:val="28"/>
+          <w:lang w:val="fr-FR"/>
+        </w:rPr>
+        <w:t xml:space="preserve"> projet</w:t>
+      </w:r>
+      <w:r>
+        <w:rPr>
+          <w:rFonts w:ascii="Segoe UI" w:hAnsi="Segoe UI" w:cs="Segoe UI"/>
+          <w:sz w:val="28"/>
+          <w:szCs w:val="28"/>
+          <w:lang w:val="fr-FR"/>
+        </w:rPr>
+        <w:t>.</w:t>
+      </w:r>
+    </w:p>
+    <w:p>
+      <w:pPr>
+        <w:rPr>
+          <w:rFonts w:ascii="ae_AlArabiya" w:hAnsi="ae_AlArabiya" w:cs="ae_AlArabiya"/>
+          <w:sz w:val="28"/>
+          <w:szCs w:val="28"/>
+          <w:lang w:val="fr-FR"/>
+        </w:rPr>
+      </w:pPr>
+    </w:p>
+    <w:p>
+      <w:pPr>
+        <w:pStyle w:val="Heading2"/>
+        <w:rPr>
+          <w:lang w:val="fr-FR"/>
+        </w:rPr>
+      </w:pPr>
+      <w:r>
+        <w:rPr>
+          <w:lang w:val="fr-FR"/>
+        </w:rPr>
+        <w:t>Chapitre 2 : Gestion de projet.</w:t>
+      </w:r>
+    </w:p>
+    <w:p>
+      <w:pPr>
+        <w:pStyle w:val="ListParagraph"/>
+        <w:numPr>
+          <w:ilvl w:val="0"/>
+          <w:numId w:val="7"/>
+        </w:numPr>
+        <w:rPr>
+          <w:rFonts w:ascii="ae_AlArabiya" w:hAnsi="ae_AlArabiya" w:cs="ae_AlArabiya"/>
+          <w:sz w:val="28"/>
+          <w:szCs w:val="28"/>
+          <w:lang w:val="fr-FR"/>
+        </w:rPr>
+      </w:pPr>
+      <w:r>
+        <w:rPr>
+          <w:rFonts w:ascii="ae_AlArabiya" w:hAnsi="ae_AlArabiya" w:cs="ae_AlArabiya"/>
+          <w:sz w:val="28"/>
+          <w:szCs w:val="28"/>
+          <w:lang w:val="fr-FR"/>
+        </w:rPr>
+        <w:t xml:space="preserve">Diagramme de </w:t>
+      </w:r>
+      <w:r>
+        <w:rPr>
+          <w:rFonts w:ascii="ae_AlArabiya" w:hAnsi="ae_AlArabiya" w:cs="ae_AlArabiya"/>
+          <w:sz w:val="28"/>
+          <w:szCs w:val="28"/>
+          <w:lang w:val="fr-FR"/>
+        </w:rPr>
+        <w:t>PERT</w:t>
+      </w:r>
+      <w:r>
+        <w:rPr>
+          <w:rFonts w:ascii="ae_AlArabiya" w:hAnsi="ae_AlArabiya" w:cs="ae_AlArabiya"/>
+          <w:sz w:val="28"/>
+          <w:szCs w:val="28"/>
+          <w:lang w:val="fr-FR"/>
+        </w:rPr>
+        <w:t>.</w:t>
+      </w:r>
+    </w:p>
+    <w:p>
+      <w:pPr>
+        <w:pStyle w:val="ListParagraph"/>
+        <w:numPr>
+          <w:ilvl w:val="1"/>
+          <w:numId w:val="7"/>
+        </w:numPr>
+        <w:rPr>
+          <w:rFonts w:ascii="ae_AlArabiya" w:hAnsi="ae_AlArabiya" w:cs="ae_AlArabiya"/>
+          <w:sz w:val="28"/>
+          <w:szCs w:val="28"/>
+          <w:lang w:val="fr-FR"/>
+        </w:rPr>
+      </w:pPr>
+      <w:r>
+        <w:rPr>
+          <w:rFonts w:ascii="ae_AlArabiya" w:hAnsi="ae_AlArabiya" w:cs="ae_AlArabiya"/>
+          <w:sz w:val="28"/>
+          <w:szCs w:val="28"/>
+          <w:lang w:val="fr-FR"/>
+        </w:rPr>
+        <w:t xml:space="preserve">Identifier </w:t>
+      </w:r>
+      <w:r>
+        <w:rPr>
+          <w:rFonts w:ascii="ae_AlArabiya" w:hAnsi="ae_AlArabiya" w:cs="ae_AlArabiya"/>
+          <w:sz w:val="28"/>
+          <w:szCs w:val="28"/>
+          <w:lang w:val="fr-FR"/>
+        </w:rPr>
+        <w:t>l</w:t>
+      </w:r>
+      <w:r>
+        <w:rPr>
+          <w:rFonts w:ascii="ae_AlArabiya" w:hAnsi="ae_AlArabiya" w:cs="ae_AlArabiya"/>
+          <w:sz w:val="28"/>
+          <w:szCs w:val="28"/>
+          <w:lang w:val="fr-FR"/>
+        </w:rPr>
+        <w:t>es taches.</w:t>
+      </w:r>
+    </w:p>
+    <w:p>
+      <w:pPr>
+        <w:pStyle w:val="ListParagraph"/>
+        <w:numPr>
+          <w:ilvl w:val="1"/>
+          <w:numId w:val="7"/>
+        </w:numPr>
+        <w:rPr>
+          <w:rFonts w:ascii="ae_AlArabiya" w:hAnsi="ae_AlArabiya" w:cs="ae_AlArabiya"/>
+          <w:sz w:val="28"/>
+          <w:szCs w:val="28"/>
+          <w:lang w:val="fr-FR"/>
+        </w:rPr>
+      </w:pPr>
+      <w:r>
+        <w:rPr>
+          <w:rFonts w:ascii="ae_AlArabiya" w:hAnsi="ae_AlArabiya" w:cs="ae_AlArabiya"/>
+          <w:sz w:val="28"/>
+          <w:szCs w:val="28"/>
+          <w:lang w:val="fr-FR"/>
+        </w:rPr>
+        <w:t>Graphe PERT</w:t>
+      </w:r>
+      <w:r>
+        <w:rPr>
+          <w:rFonts w:ascii="ae_AlArabiya" w:hAnsi="ae_AlArabiya" w:cs="ae_AlArabiya"/>
+          <w:sz w:val="28"/>
+          <w:szCs w:val="28"/>
+          <w:lang w:val="fr-FR"/>
+        </w:rPr>
+        <w:t xml:space="preserve"> Probabiliste</w:t>
+      </w:r>
+      <w:r>
+        <w:rPr>
+          <w:rFonts w:ascii="ae_AlArabiya" w:hAnsi="ae_AlArabiya" w:cs="ae_AlArabiya"/>
+          <w:sz w:val="28"/>
+          <w:szCs w:val="28"/>
+          <w:lang w:val="fr-FR"/>
+        </w:rPr>
+        <w:t>.</w:t>
+      </w:r>
+    </w:p>
+    <w:p>
+      <w:pPr>
+        <w:pStyle w:val="ListParagraph"/>
+        <w:numPr>
+          <w:ilvl w:val="1"/>
+          <w:numId w:val="7"/>
+        </w:numPr>
+        <w:rPr>
+          <w:rFonts w:ascii="ae_AlArabiya" w:hAnsi="ae_AlArabiya" w:cs="ae_AlArabiya"/>
+          <w:sz w:val="28"/>
+          <w:szCs w:val="28"/>
+          <w:lang w:val="fr-FR"/>
+        </w:rPr>
+      </w:pPr>
+      <w:r>
+        <w:rPr>
+          <w:rFonts w:ascii="ae_AlArabiya" w:hAnsi="ae_AlArabiya" w:cs="ae_AlArabiya"/>
+          <w:sz w:val="28"/>
+          <w:szCs w:val="28"/>
+          <w:lang w:val="fr-FR"/>
+        </w:rPr>
+        <w:t>Chemin Critique.</w:t>
+      </w:r>
+    </w:p>
+    <w:p>
+      <w:pPr>
+        <w:pStyle w:val="ListParagraph"/>
+        <w:numPr>
+          <w:ilvl w:val="0"/>
+          <w:numId w:val="7"/>
+        </w:numPr>
+        <w:rPr>
+          <w:rFonts w:ascii="ae_AlArabiya" w:hAnsi="ae_AlArabiya" w:cs="ae_AlArabiya"/>
+          <w:sz w:val="28"/>
+          <w:szCs w:val="28"/>
+          <w:lang w:val="fr-FR"/>
+        </w:rPr>
+      </w:pPr>
+      <w:r>
+        <w:rPr>
+          <w:rFonts w:ascii="ae_AlArabiya" w:hAnsi="ae_AlArabiya" w:cs="ae_AlArabiya"/>
+          <w:sz w:val="28"/>
+          <w:szCs w:val="28"/>
+          <w:lang w:val="fr-FR"/>
+        </w:rPr>
+        <w:t>D</w:t>
+      </w:r>
+      <w:r>
+        <w:rPr>
+          <w:rFonts w:ascii="ae_AlArabiya" w:hAnsi="ae_AlArabiya" w:cs="ae_AlArabiya"/>
+          <w:sz w:val="28"/>
+          <w:szCs w:val="28"/>
+          <w:lang w:val="fr-FR"/>
+        </w:rPr>
+        <w:t>iagramme de GANTT</w:t>
+      </w:r>
+      <w:r>
+        <w:rPr>
+          <w:rFonts w:ascii="ae_AlArabiya" w:hAnsi="ae_AlArabiya" w:cs="ae_AlArabiya"/>
+          <w:sz w:val="28"/>
+          <w:szCs w:val="28"/>
+          <w:lang w:val="fr-FR"/>
+        </w:rPr>
+        <w:t>.</w:t>
+      </w:r>
+    </w:p>
+    <w:p>
+      <w:pPr>
+        <w:pStyle w:val="ListParagraph"/>
+        <w:numPr>
+          <w:ilvl w:val="0"/>
+          <w:numId w:val="7"/>
+        </w:numPr>
+        <w:rPr>
+          <w:rFonts w:ascii="ae_AlArabiya" w:hAnsi="ae_AlArabiya" w:cs="ae_AlArabiya"/>
+          <w:sz w:val="28"/>
+          <w:szCs w:val="28"/>
+          <w:lang w:val="fr-FR"/>
+        </w:rPr>
+      </w:pPr>
+      <w:r>
+        <w:rPr>
+          <w:rFonts w:ascii="ae_AlArabiya" w:hAnsi="ae_AlArabiya" w:cs="ae_AlArabiya"/>
+          <w:sz w:val="28"/>
+          <w:szCs w:val="28"/>
+          <w:lang w:val="fr-FR"/>
+        </w:rPr>
+        <w:t>Estimation des charges.</w:t>
+      </w:r>
+    </w:p>
+    <w:p>
+      <w:pPr>
+        <w:rPr>
+          <w:rFonts w:ascii="ae_AlArabiya" w:hAnsi="ae_AlArabiya" w:cs="ae_AlArabiya"/>
+          <w:sz w:val="28"/>
+          <w:szCs w:val="28"/>
+          <w:lang w:val="fr-FR"/>
+        </w:rPr>
+      </w:pPr>
+    </w:p>
+    <w:p>
+      <w:pPr>
+        <w:pStyle w:val="Heading2"/>
+        <w:rPr>
+          <w:lang w:val="fr-FR"/>
+        </w:rPr>
+      </w:pPr>
+      <w:r>
+        <w:rPr>
+          <w:lang w:val="fr-FR"/>
+        </w:rPr>
+        <w:t>Chapitre 3 : Conception.</w:t>
+      </w:r>
+    </w:p>
+    <w:p>
+      <w:pPr>
+        <w:pStyle w:val="ListParagraph"/>
+        <w:numPr>
+          <w:ilvl w:val="0"/>
+          <w:numId w:val="7"/>
+        </w:numPr>
+        <w:rPr>
+          <w:rFonts w:ascii="ae_AlArabiya" w:hAnsi="ae_AlArabiya" w:cs="ae_AlArabiya"/>
+          <w:sz w:val="28"/>
+          <w:szCs w:val="28"/>
+          <w:lang w:val="fr-FR"/>
+        </w:rPr>
+      </w:pPr>
+      <w:r>
+        <w:rPr>
+          <w:rFonts w:ascii="ae_AlArabiya" w:hAnsi="ae_AlArabiya" w:cs="ae_AlArabiya"/>
+          <w:sz w:val="28"/>
+          <w:szCs w:val="28"/>
+          <w:lang w:val="fr-FR"/>
+        </w:rPr>
+        <w:t xml:space="preserve">Diagramme </w:t>
+      </w:r>
+      <w:r>
+        <w:rPr>
+          <w:rFonts w:ascii="ae_AlArabiya" w:hAnsi="ae_AlArabiya" w:cs="ae_AlArabiya"/>
+          <w:sz w:val="28"/>
+          <w:szCs w:val="28"/>
+          <w:lang w:val="fr-FR"/>
+        </w:rPr>
+        <w:t>de cas d’utilisation.</w:t>
+      </w:r>
+    </w:p>
+    <w:p>
+      <w:pPr>
+        <w:pStyle w:val="ListParagraph"/>
+        <w:numPr>
+          <w:ilvl w:val="0"/>
+          <w:numId w:val="7"/>
+        </w:numPr>
+        <w:rPr>
+          <w:rFonts w:ascii="ae_AlArabiya" w:hAnsi="ae_AlArabiya" w:cs="ae_AlArabiya"/>
+          <w:sz w:val="28"/>
+          <w:szCs w:val="28"/>
+          <w:lang w:val="fr-FR"/>
+        </w:rPr>
+      </w:pPr>
+      <w:r>
+        <w:rPr>
+          <w:rFonts w:ascii="ae_AlArabiya" w:hAnsi="ae_AlArabiya" w:cs="ae_AlArabiya"/>
+          <w:sz w:val="28"/>
+          <w:szCs w:val="28"/>
+          <w:lang w:val="fr-FR"/>
+        </w:rPr>
+        <w:t xml:space="preserve">Diagramme de </w:t>
+      </w:r>
+      <w:r>
+        <w:rPr>
+          <w:rFonts w:ascii="ae_AlArabiya" w:hAnsi="ae_AlArabiya" w:cs="ae_AlArabiya"/>
+          <w:sz w:val="28"/>
+          <w:szCs w:val="28"/>
+          <w:lang w:val="fr-FR"/>
+        </w:rPr>
+        <w:t>séquence.</w:t>
+      </w:r>
+    </w:p>
+    <w:p>
+      <w:pPr>
+        <w:pStyle w:val="ListParagraph"/>
+        <w:numPr>
+          <w:ilvl w:val="0"/>
+          <w:numId w:val="7"/>
+        </w:numPr>
+        <w:rPr>
+          <w:rFonts w:ascii="ae_AlArabiya" w:hAnsi="ae_AlArabiya" w:cs="ae_AlArabiya"/>
+          <w:sz w:val="28"/>
+          <w:szCs w:val="28"/>
+          <w:lang w:val="fr-FR"/>
+        </w:rPr>
+      </w:pPr>
+      <w:r>
+        <w:rPr>
+          <w:rFonts w:ascii="ae_AlArabiya" w:hAnsi="ae_AlArabiya" w:cs="ae_AlArabiya"/>
+          <w:sz w:val="28"/>
+          <w:szCs w:val="28"/>
+          <w:lang w:val="fr-FR"/>
+        </w:rPr>
+        <w:t>Diagramme de classes.</w:t>
+      </w:r>
+    </w:p>
+    <w:p>
+      <w:pPr>
+        <w:pStyle w:val="ListParagraph"/>
+        <w:numPr>
+          <w:ilvl w:val="0"/>
+          <w:numId w:val="7"/>
+        </w:numPr>
+        <w:rPr>
+          <w:rFonts w:ascii="ae_AlArabiya" w:hAnsi="ae_AlArabiya" w:cs="ae_AlArabiya"/>
+          <w:sz w:val="28"/>
+          <w:szCs w:val="28"/>
+          <w:lang w:val="fr-FR"/>
+        </w:rPr>
+      </w:pPr>
+      <w:r>
+        <w:rPr>
+          <w:rFonts w:ascii="ae_AlArabiya" w:hAnsi="ae_AlArabiya" w:cs="ae_AlArabiya"/>
+          <w:sz w:val="28"/>
+          <w:szCs w:val="28"/>
+          <w:lang w:val="fr-FR"/>
+        </w:rPr>
+        <w:t>Diagramme d’activité.</w:t>
+      </w:r>
+    </w:p>
+    <w:p>
+      <w:pPr>
+        <w:pStyle w:val="ListParagraph"/>
+        <w:numPr>
+          <w:ilvl w:val="0"/>
+          <w:numId w:val="7"/>
+        </w:numPr>
+        <w:rPr>
+          <w:rFonts w:ascii="ae_AlArabiya" w:hAnsi="ae_AlArabiya" w:cs="ae_AlArabiya"/>
+          <w:sz w:val="28"/>
+          <w:szCs w:val="28"/>
+          <w:lang w:val="fr-FR"/>
+        </w:rPr>
+      </w:pPr>
+      <w:r>
+        <w:rPr>
+          <w:rFonts w:ascii="ae_AlArabiya" w:hAnsi="ae_AlArabiya" w:cs="ae_AlArabiya"/>
+          <w:sz w:val="28"/>
+          <w:szCs w:val="28"/>
+          <w:lang w:val="fr-FR"/>
+        </w:rPr>
+        <w:t>Diagramme de collaboration.</w:t>
+      </w:r>
+    </w:p>
+    <w:p>
+      <w:pPr>
+        <w:pStyle w:val="ListParagraph"/>
+        <w:numPr>
+          <w:ilvl w:val="0"/>
+          <w:numId w:val="7"/>
+        </w:numPr>
+        <w:rPr>
+          <w:rFonts w:ascii="ae_AlArabiya" w:hAnsi="ae_AlArabiya" w:cs="ae_AlArabiya"/>
+          <w:sz w:val="28"/>
+          <w:szCs w:val="28"/>
+          <w:lang w:val="fr-FR"/>
+        </w:rPr>
+      </w:pPr>
+      <w:r>
+        <w:rPr>
+          <w:rFonts w:ascii="ae_AlArabiya" w:hAnsi="ae_AlArabiya" w:cs="ae_AlArabiya"/>
+          <w:sz w:val="28"/>
+          <w:szCs w:val="28"/>
+          <w:lang w:val="fr-FR"/>
+        </w:rPr>
+        <w:t>Diagramme d’état.</w:t>
+      </w:r>
+    </w:p>
+    <w:p>
+      <w:pPr>
+        <w:pStyle w:val="ListParagraph"/>
+        <w:rPr>
+          <w:rFonts w:ascii="ae_AlArabiya" w:hAnsi="ae_AlArabiya" w:cs="ae_AlArabiya"/>
+          <w:sz w:val="28"/>
+          <w:szCs w:val="28"/>
+          <w:lang w:val="fr-FR"/>
+        </w:rPr>
+      </w:pPr>
+    </w:p>
+    <w:p>
+      <w:pPr>
+        <w:pStyle w:val="ListParagraph"/>
+        <w:rPr>
+          <w:rFonts w:ascii="ae_AlArabiya" w:hAnsi="ae_AlArabiya" w:cs="ae_AlArabiya"/>
+          <w:sz w:val="28"/>
+          <w:szCs w:val="28"/>
+          <w:lang w:val="fr-FR"/>
+        </w:rPr>
+      </w:pPr>
+    </w:p>
+    <w:p>
+      <w:pPr>
+        <w:pStyle w:val="ListParagraph"/>
+        <w:rPr>
+          <w:rFonts w:ascii="ae_AlArabiya" w:hAnsi="ae_AlArabiya" w:cs="ae_AlArabiya"/>
+          <w:sz w:val="28"/>
+          <w:szCs w:val="28"/>
+          <w:lang w:val="fr-FR"/>
+        </w:rPr>
+      </w:pPr>
+    </w:p>
+    <w:p>
+      <w:pPr>
+        <w:pStyle w:val="ListParagraph"/>
+        <w:rPr>
+          <w:rFonts w:ascii="ae_AlArabiya" w:hAnsi="ae_AlArabiya" w:cs="ae_AlArabiya"/>
+          <w:sz w:val="28"/>
+          <w:szCs w:val="28"/>
+          <w:lang w:val="fr-FR"/>
+        </w:rPr>
+      </w:pPr>
+    </w:p>
+    <w:p>
+      <w:pPr>
+        <w:pStyle w:val="ListParagraph"/>
+        <w:rPr>
+          <w:rFonts w:ascii="ae_AlArabiya" w:hAnsi="ae_AlArabiya" w:cs="ae_AlArabiya"/>
+          <w:sz w:val="28"/>
+          <w:szCs w:val="28"/>
+          <w:lang w:val="fr-FR"/>
+        </w:rPr>
+      </w:pPr>
+    </w:p>
+    <w:p>
+      <w:pPr>
+        <w:pStyle w:val="ListParagraph"/>
+        <w:rPr>
+          <w:rFonts w:ascii="ae_AlArabiya" w:hAnsi="ae_AlArabiya" w:cs="ae_AlArabiya"/>
+          <w:sz w:val="40"/>
+          <w:szCs w:val="40"/>
+          <w:lang w:val="fr-FR"/>
+        </w:rPr>
+      </w:pPr>
+    </w:p>
+    <w:p>
+      <w:pPr>
+        <w:pStyle w:val="Heading1"/>
+        <w:rPr>
+          <w:lang w:val="fr-FR"/>
+        </w:rPr>
+      </w:pPr>
+      <w:r>
+        <w:rPr>
+          <w:lang w:val="fr-FR"/>
+        </w:rPr>
+        <w:t xml:space="preserve">Chapitre 1 : </w:t>
+      </w:r>
+      <w:r>
+        <w:rPr>
+          <w:lang w:val="fr-FR"/>
+        </w:rPr>
+        <w:t>Introduction Générale</w:t>
+      </w:r>
+      <w:r>
+        <w:rPr>
+          <w:lang w:val="fr-FR"/>
+        </w:rPr>
+        <w:t>.</w:t>
+      </w:r>
+    </w:p>
+    <w:p>
+      <w:pPr>
+        <w:rPr>
+          <w:rFonts w:ascii="ae_AlArabiya" w:hAnsi="ae_AlArabiya" w:cs="ae_AlArabiya"/>
+          <w:sz w:val="40"/>
+          <w:szCs w:val="40"/>
+          <w:lang w:val="fr-FR"/>
+        </w:rPr>
+      </w:pPr>
+    </w:p>
+    <w:p>
+      <w:pPr>
+        <w:pStyle w:val="Heading3"/>
+        <w:numPr>
+          <w:ilvl w:val="0"/>
+          <w:numId w:val="15"/>
+        </w:numPr>
+        <w:rPr>
+          <w:lang w:val="fr-FR"/>
+        </w:rPr>
+      </w:pPr>
+      <w:r>
+        <w:rPr>
+          <w:lang w:val="fr-FR"/>
+        </w:rPr>
+        <w:t>Remerciement.</w:t>
+      </w:r>
+    </w:p>
+    <w:p>
+      <w:pPr>
+        <w:rPr>
+          <w:lang w:val="fr-FR"/>
+        </w:rPr>
+      </w:pPr>
+    </w:p>
+    <w:p>
+      <w:pPr>
+        <w:rPr>
+          <w:rFonts w:ascii="ae_AlArabiya" w:hAnsi="ae_AlArabiya" w:cs="ae_AlArabiya"/>
+          <w:sz w:val="28"/>
+          <w:szCs w:val="28"/>
+          <w:lang w:val="fr-FR"/>
+        </w:rPr>
+      </w:pPr>
+      <w:r>
+        <w:rPr>
+          <w:rFonts w:ascii="ae_AlArabiya" w:hAnsi="ae_AlArabiya" w:cs="ae_AlArabiya"/>
+          <w:sz w:val="28"/>
+          <w:szCs w:val="28"/>
+          <w:lang w:val="fr-FR"/>
+        </w:rPr>
+        <w:t>Nous</w:t>
+      </w:r>
+      <w:r>
+        <w:rPr>
+          <w:rFonts w:ascii="ae_AlArabiya" w:hAnsi="ae_AlArabiya" w:cs="ae_AlArabiya"/>
+          <w:sz w:val="28"/>
+          <w:szCs w:val="28"/>
+          <w:lang w:val="fr-FR"/>
+        </w:rPr>
+        <w:t xml:space="preserve"> </w:t>
+      </w:r>
+      <w:r>
+        <w:rPr>
+          <w:rFonts w:ascii="ae_AlArabiya" w:hAnsi="ae_AlArabiya" w:cs="ae_AlArabiya"/>
+          <w:sz w:val="28"/>
+          <w:szCs w:val="28"/>
+          <w:lang w:val="fr-FR"/>
+        </w:rPr>
+        <w:t>te</w:t>
+      </w:r>
+      <w:r>
+        <w:rPr>
+          <w:rFonts w:ascii="ae_AlArabiya" w:hAnsi="ae_AlArabiya" w:cs="ae_AlArabiya"/>
+          <w:sz w:val="28"/>
+          <w:szCs w:val="28"/>
+          <w:lang w:val="fr-FR"/>
+        </w:rPr>
+        <w:t>n</w:t>
+      </w:r>
+      <w:r>
+        <w:rPr>
+          <w:rFonts w:ascii="ae_AlArabiya" w:hAnsi="ae_AlArabiya" w:cs="ae_AlArabiya"/>
+          <w:sz w:val="28"/>
+          <w:szCs w:val="28"/>
+          <w:lang w:val="fr-FR"/>
+        </w:rPr>
+        <w:t>on</w:t>
+      </w:r>
+      <w:r>
+        <w:rPr>
+          <w:rFonts w:ascii="ae_AlArabiya" w:hAnsi="ae_AlArabiya" w:cs="ae_AlArabiya"/>
+          <w:sz w:val="28"/>
+          <w:szCs w:val="28"/>
+          <w:lang w:val="fr-FR"/>
+        </w:rPr>
+        <w:t>s à remercier particulièrement Monsieur Souhaib et Monsieur Berich Pour nous accompa</w:t>
+      </w:r>
+      <w:r>
+        <w:rPr>
+          <w:rFonts w:ascii="ae_AlArabiya" w:hAnsi="ae_AlArabiya" w:cs="ae_AlArabiya"/>
+          <w:sz w:val="28"/>
+          <w:szCs w:val="28"/>
+          <w:lang w:val="fr-FR"/>
+        </w:rPr>
+        <w:t>gner durant ce projet, et nous don</w:t>
+      </w:r>
+      <w:r>
+        <w:rPr>
+          <w:rFonts w:ascii="ae_AlArabiya" w:hAnsi="ae_AlArabiya" w:cs="ae_AlArabiya"/>
+          <w:sz w:val="28"/>
+          <w:szCs w:val="28"/>
+          <w:lang w:val="fr-FR"/>
+        </w:rPr>
+        <w:t>n</w:t>
+      </w:r>
+      <w:r>
+        <w:rPr>
+          <w:rFonts w:ascii="ae_AlArabiya" w:hAnsi="ae_AlArabiya" w:cs="ae_AlArabiya"/>
+          <w:sz w:val="28"/>
+          <w:szCs w:val="28"/>
+          <w:lang w:val="fr-FR"/>
+        </w:rPr>
+        <w:t xml:space="preserve">er des conseils et des astuces que ça soit les missions évoquées </w:t>
+      </w:r>
+      <w:r>
+        <w:rPr>
+          <w:rFonts w:ascii="ae_AlArabiya" w:hAnsi="ae_AlArabiya" w:cs="ae_AlArabiya"/>
+          <w:sz w:val="28"/>
+          <w:szCs w:val="28"/>
+          <w:lang w:val="fr-FR"/>
+        </w:rPr>
+        <w:t>de gestion du</w:t>
+      </w:r>
+      <w:r>
+        <w:rPr>
+          <w:rFonts w:ascii="ae_AlArabiya" w:hAnsi="ae_AlArabiya" w:cs="ae_AlArabiya"/>
+          <w:sz w:val="28"/>
+          <w:szCs w:val="28"/>
+          <w:lang w:val="fr-FR"/>
+        </w:rPr>
+        <w:t xml:space="preserve"> projet</w:t>
+      </w:r>
+      <w:r>
+        <w:rPr>
+          <w:rFonts w:ascii="ae_AlArabiya" w:hAnsi="ae_AlArabiya" w:cs="ae_AlArabiya"/>
+          <w:sz w:val="28"/>
+          <w:szCs w:val="28"/>
+          <w:lang w:val="fr-FR"/>
+        </w:rPr>
+        <w:t>,</w:t>
+      </w:r>
+      <w:r>
+        <w:rPr>
+          <w:rFonts w:ascii="ae_AlArabiya" w:hAnsi="ae_AlArabiya" w:cs="ae_AlArabiya"/>
+          <w:sz w:val="28"/>
+          <w:szCs w:val="28"/>
+          <w:lang w:val="fr-FR"/>
+        </w:rPr>
+        <w:t xml:space="preserve"> ou les missions concernant la conception UML.</w:t>
+      </w:r>
+    </w:p>
+    <w:p>
+      <w:pPr>
+        <w:rPr>
+          <w:rFonts w:ascii="ae_AlArabiya" w:hAnsi="ae_AlArabiya" w:cs="ae_AlArabiya"/>
+          <w:sz w:val="40"/>
+          <w:szCs w:val="40"/>
+          <w:lang w:val="fr-FR"/>
+        </w:rPr>
+      </w:pPr>
+    </w:p>
+    <w:p>
+      <w:pPr>
+        <w:pStyle w:val="Heading3"/>
+        <w:numPr>
+          <w:ilvl w:val="0"/>
+          <w:numId w:val="15"/>
+        </w:numPr>
+        <w:rPr>
+          <w:lang w:val="fr-FR"/>
+        </w:rPr>
+      </w:pPr>
+      <w:r>
+        <w:rPr>
+          <w:lang w:val="fr-FR"/>
+        </w:rPr>
+        <w:t>Résumé.</w:t>
+      </w:r>
+    </w:p>
+    <w:p>
+      <w:pPr>
+        <w:rPr>
+          <w:lang w:val="fr-FR"/>
+        </w:rPr>
+      </w:pPr>
+    </w:p>
+    <w:p>
+      <w:pPr>
+        <w:rPr>
+          <w:rFonts w:ascii="ae_AlArabiya" w:hAnsi="ae_AlArabiya" w:cs="ae_AlArabiya"/>
+          <w:sz w:val="28"/>
+          <w:szCs w:val="28"/>
+          <w:lang w:val="fr-FR"/>
+        </w:rPr>
+      </w:pPr>
+      <w:r>
+        <w:rPr>
+          <w:rFonts w:ascii="ae_AlArabiya" w:hAnsi="ae_AlArabiya" w:cs="ae_AlArabiya"/>
+          <w:sz w:val="28"/>
+          <w:szCs w:val="28"/>
+          <w:lang w:val="fr-FR"/>
+        </w:rPr>
+        <w:t>La réalisation de ce mini projet a été une bonne occasion pour nous d’une part d’assimiler les différents outils acquis durant ce semestre,</w:t>
+      </w:r>
+      <w:r>
+        <w:rPr>
+          <w:rFonts w:ascii="ae_AlArabiya" w:hAnsi="ae_AlArabiya" w:cs="ae_AlArabiya"/>
+          <w:sz w:val="28"/>
+          <w:szCs w:val="28"/>
+          <w:lang w:val="fr-FR"/>
+        </w:rPr>
+        <w:t xml:space="preserve"> </w:t>
+      </w:r>
+      <w:r>
+        <w:rPr>
+          <w:rFonts w:ascii="ae_AlArabiya" w:hAnsi="ae_AlArabiya" w:cs="ae_AlArabiya"/>
+          <w:sz w:val="28"/>
+          <w:szCs w:val="28"/>
+          <w:lang w:val="fr-FR"/>
+        </w:rPr>
+        <w:t xml:space="preserve">et aussi d’acquérir des nouvelles </w:t>
+      </w:r>
+      <w:r>
+        <w:rPr>
+          <w:rFonts w:ascii="ae_AlArabiya" w:hAnsi="ae_AlArabiya" w:cs="ae_AlArabiya"/>
+          <w:sz w:val="28"/>
+          <w:szCs w:val="28"/>
+          <w:lang w:val="fr-FR"/>
+        </w:rPr>
+        <w:t xml:space="preserve">connaissances et des techniques d’une façon </w:t>
+      </w:r>
+      <w:r>
+        <w:rPr>
+          <w:rFonts w:ascii="ae_AlArabiya" w:hAnsi="ae_AlArabiya" w:cs="ae_AlArabiya"/>
+          <w:sz w:val="28"/>
+          <w:szCs w:val="28"/>
+          <w:lang w:val="fr-FR"/>
+        </w:rPr>
+        <w:t>professionnelle</w:t>
+      </w:r>
+      <w:r>
+        <w:rPr>
+          <w:rFonts w:ascii="ae_AlArabiya" w:hAnsi="ae_AlArabiya" w:cs="ae_AlArabiya"/>
+          <w:sz w:val="28"/>
+          <w:szCs w:val="28"/>
+          <w:lang w:val="fr-FR"/>
+        </w:rPr>
+        <w:t>.</w:t>
+      </w:r>
+    </w:p>
+    <w:p>
+      <w:pPr>
+        <w:rPr>
+          <w:rFonts w:ascii="ae_AlArabiya" w:hAnsi="ae_AlArabiya" w:cs="ae_AlArabiya"/>
+          <w:sz w:val="40"/>
+          <w:szCs w:val="40"/>
+          <w:lang w:val="fr-FR"/>
+        </w:rPr>
+      </w:pPr>
+    </w:p>
+    <w:p>
+      <w:pPr>
+        <w:pStyle w:val="Heading3"/>
+        <w:numPr>
+          <w:ilvl w:val="0"/>
+          <w:numId w:val="15"/>
+        </w:numPr>
+        <w:rPr>
+          <w:lang w:val="fr-FR"/>
+        </w:rPr>
+      </w:pPr>
+      <w:r>
+        <w:rPr>
+          <w:lang w:val="fr-FR"/>
+        </w:rPr>
+        <w:t>Présentation de projet.</w:t>
+      </w:r>
+    </w:p>
+    <w:p>
+      <w:pPr>
+        <w:rPr>
+          <w:lang w:val="fr-FR"/>
+        </w:rPr>
+      </w:pPr>
+    </w:p>
+    <w:p>
+      <w:pPr>
+        <w:rPr>
+          <w:rFonts w:ascii="ae_AlArabiya" w:hAnsi="ae_AlArabiya" w:cs="ae_AlArabiya"/>
+          <w:sz w:val="28"/>
+          <w:szCs w:val="28"/>
+          <w:lang w:val="fr-FR"/>
+        </w:rPr>
+      </w:pPr>
+      <w:r>
+        <w:rPr>
+          <w:rFonts w:ascii="ae_AlArabiya" w:hAnsi="ae_AlArabiya" w:cs="ae_AlArabiya"/>
+          <w:sz w:val="28"/>
+          <w:szCs w:val="28"/>
+          <w:lang w:val="fr-FR"/>
+        </w:rPr>
+        <w:t>Le Principe mission de ce projet est de réaliser une application JAVA Client-serveur qui permet d’un ou plusieurs clients d’interagir avec un serveur en utilisant les sockets.</w:t>
+      </w:r>
+    </w:p>
+    <w:p>
+      <w:pPr>
+        <w:rPr>
+          <w:rFonts w:ascii="ae_AlArabiya" w:hAnsi="ae_AlArabiya" w:cs="ae_AlArabiya"/>
+          <w:sz w:val="28"/>
+          <w:szCs w:val="28"/>
+          <w:lang w:val="fr-FR"/>
+        </w:rPr>
+      </w:pPr>
+      <w:r>
+        <w:rPr>
+          <w:rFonts w:ascii="ae_AlArabiya" w:hAnsi="ae_AlArabiya" w:cs="ae_AlArabiya"/>
+          <w:sz w:val="28"/>
+          <w:szCs w:val="28"/>
+          <w:lang w:val="fr-FR"/>
+        </w:rPr>
+        <w:lastRenderedPageBreak/>
+        <w:t xml:space="preserve">L’application est sous forme d’un ancien jeu japonaise qu’il s’appelle « «, il permet à deux </w:t>
+      </w:r>
+      <w:r>
+        <w:rPr>
+          <w:rFonts w:ascii="ae_AlArabiya" w:hAnsi="ae_AlArabiya" w:cs="ae_AlArabiya"/>
+          <w:sz w:val="28"/>
+          <w:szCs w:val="28"/>
+          <w:lang w:val="fr-FR"/>
+        </w:rPr>
+        <w:t>clients</w:t>
+      </w:r>
+      <w:r>
+        <w:rPr>
+          <w:rFonts w:ascii="ae_AlArabiya" w:hAnsi="ae_AlArabiya" w:cs="ae_AlArabiya"/>
+          <w:sz w:val="28"/>
+          <w:szCs w:val="28"/>
+          <w:lang w:val="fr-FR"/>
+        </w:rPr>
+        <w:t xml:space="preserve"> de jouer entre eux à travers d’un serveur socket.</w:t>
+      </w:r>
+    </w:p>
+    <w:p>
+      <w:pPr>
+        <w:rPr>
+          <w:rFonts w:ascii="ae_AlArabiya" w:hAnsi="ae_AlArabiya" w:cs="ae_AlArabiya"/>
+          <w:sz w:val="28"/>
+          <w:szCs w:val="28"/>
+          <w:lang w:val="fr-FR"/>
+        </w:rPr>
+      </w:pPr>
+    </w:p>
+    <w:p>
+      <w:pPr>
+        <w:pStyle w:val="Heading1"/>
+        <w:rPr>
+          <w:rFonts w:ascii="ae_AlArabiya" w:hAnsi="ae_AlArabiya" w:cs="ae_AlArabiya"/>
+          <w:sz w:val="40"/>
+          <w:szCs w:val="40"/>
+          <w:lang w:val="fr-FR"/>
+        </w:rPr>
+      </w:pPr>
+      <w:r>
+        <w:rPr>
+          <w:lang w:val="fr-FR"/>
+        </w:rPr>
+        <w:t xml:space="preserve">Chapitre 2 : </w:t>
+      </w:r>
+      <w:r>
+        <w:rPr>
+          <w:lang w:val="fr-FR"/>
+        </w:rPr>
+        <w:t>Gestion du projet.</w:t>
+      </w:r>
+    </w:p>
+    <w:p>
+      <w:pPr>
         <w:rPr>
           <w:rFonts w:ascii="Segoe UI" w:hAnsi="Segoe UI" w:cs="Segoe UI"/>
           <w:b/>
@@ -418,44 +1491,42 @@
           <w:szCs w:val="44"/>
           <w:lang w:val="fr-FR"/>
         </w:rPr>
-        <w:lastRenderedPageBreak/>
-        <w:t>Sommaire</w:t>
-      </w:r>
-      <w:r>
-        <w:rPr>
-          <w:rFonts w:ascii="Segoe UI" w:hAnsi="Segoe UI" w:cs="Segoe UI"/>
-          <w:b/>
-          <w:bCs/>
-          <w:color w:val="2E74B5" w:themeColor="accent1" w:themeShade="BF"/>
-          <w:sz w:val="44"/>
-          <w:szCs w:val="44"/>
-          <w:lang w:val="fr-FR"/>
-        </w:rPr>
-        <w:t> </w:t>
-      </w:r>
-      <w:r>
-        <w:rPr>
-          <w:rFonts w:ascii="Segoe UI" w:hAnsi="Segoe UI" w:cs="Segoe UI"/>
-          <w:color w:val="2E74B5" w:themeColor="accent1" w:themeShade="BF"/>
-          <w:sz w:val="44"/>
-          <w:szCs w:val="44"/>
-          <w:lang w:val="fr-FR"/>
-        </w:rPr>
-        <w:t xml:space="preserve">: </w:t>
-      </w:r>
-    </w:p>
-    <w:p>
-      <w:pPr>
-        <w:rPr>
-          <w:rFonts w:ascii="Segoe UI" w:hAnsi="Segoe UI" w:cs="Segoe UI"/>
-          <w:sz w:val="36"/>
-          <w:szCs w:val="36"/>
-          <w:lang w:val="fr-FR"/>
-        </w:rPr>
-      </w:pPr>
-    </w:p>
-    <w:p>
-      <w:pPr>
+      </w:pPr>
+    </w:p>
+    <w:p>
+      <w:pPr>
+        <w:pStyle w:val="Heading3"/>
+        <w:numPr>
+          <w:ilvl w:val="0"/>
+          <w:numId w:val="16"/>
+        </w:numPr>
+        <w:rPr>
+          <w:lang w:val="fr-FR"/>
+        </w:rPr>
+      </w:pPr>
+      <w:r>
+        <w:rPr>
+          <w:lang w:val="fr-FR"/>
+        </w:rPr>
+        <w:t xml:space="preserve">Diagramme de </w:t>
+      </w:r>
+      <w:r>
+        <w:rPr>
+          <w:lang w:val="fr-FR"/>
+        </w:rPr>
+        <w:t>PERT</w:t>
+      </w:r>
+      <w:r>
+        <w:rPr>
+          <w:lang w:val="fr-FR"/>
+        </w:rPr>
+        <w:t>.</w:t>
+      </w:r>
+    </w:p>
+    <w:p>
+      <w:pPr>
+        <w:pStyle w:val="ListParagraph"/>
+        <w:ind w:left="1080"/>
         <w:rPr>
           <w:rFonts w:ascii="ae_AlArabiya" w:hAnsi="ae_AlArabiya" w:cs="ae_AlArabiya"/>
           <w:b/>
@@ -465,1201 +1536,31 @@
           <w:lang w:val="fr-FR"/>
         </w:rPr>
       </w:pPr>
-      <w:r>
-        <w:rPr>
-          <w:rFonts w:ascii="ae_AlArabiya" w:hAnsi="ae_AlArabiya" w:cs="ae_AlArabiya"/>
-          <w:b/>
-          <w:bCs/>
-          <w:sz w:val="32"/>
-          <w:szCs w:val="32"/>
-          <w:lang w:val="fr-FR"/>
-        </w:rPr>
-        <w:t>Chapitre 1 : Introduction Générale</w:t>
-      </w:r>
-      <w:r>
-        <w:rPr>
-          <w:rFonts w:ascii="ae_AlArabiya" w:hAnsi="ae_AlArabiya" w:cs="ae_AlArabiya"/>
-          <w:b/>
-          <w:bCs/>
-          <w:sz w:val="32"/>
-          <w:szCs w:val="32"/>
-          <w:lang w:val="fr-FR"/>
-        </w:rPr>
-        <w:t>.</w:t>
-      </w:r>
-    </w:p>
-    <w:p>
-      <w:pPr>
-        <w:pStyle w:val="ListParagraph"/>
-        <w:numPr>
-          <w:ilvl w:val="0"/>
-          <w:numId w:val="8"/>
-        </w:numPr>
-        <w:rPr>
-          <w:rFonts w:ascii="Segoe UI" w:hAnsi="Segoe UI" w:cs="Segoe UI"/>
-          <w:sz w:val="28"/>
-          <w:szCs w:val="28"/>
-          <w:lang w:val="fr-FR"/>
-        </w:rPr>
-      </w:pPr>
-      <w:r>
-        <w:rPr>
-          <w:rFonts w:ascii="Segoe UI" w:hAnsi="Segoe UI" w:cs="Segoe UI"/>
-          <w:sz w:val="28"/>
-          <w:szCs w:val="28"/>
-          <w:lang w:val="fr-FR"/>
-        </w:rPr>
-        <w:t>Remerciement.</w:t>
-      </w:r>
-    </w:p>
-    <w:p>
-      <w:pPr>
-        <w:pStyle w:val="ListParagraph"/>
-        <w:numPr>
-          <w:ilvl w:val="0"/>
-          <w:numId w:val="8"/>
-        </w:numPr>
-        <w:rPr>
-          <w:rFonts w:ascii="Segoe UI" w:hAnsi="Segoe UI" w:cs="Segoe UI"/>
-          <w:sz w:val="28"/>
-          <w:szCs w:val="28"/>
-          <w:lang w:val="fr-FR"/>
-        </w:rPr>
-      </w:pPr>
-      <w:r>
-        <w:rPr>
-          <w:rFonts w:ascii="Segoe UI" w:hAnsi="Segoe UI" w:cs="Segoe UI"/>
-          <w:sz w:val="28"/>
-          <w:szCs w:val="28"/>
-          <w:lang w:val="fr-FR"/>
-        </w:rPr>
-        <w:t>Résumé</w:t>
-      </w:r>
-      <w:r>
-        <w:rPr>
-          <w:rFonts w:ascii="Segoe UI" w:hAnsi="Segoe UI" w:cs="Segoe UI"/>
-          <w:sz w:val="28"/>
-          <w:szCs w:val="28"/>
-          <w:lang w:val="fr-FR"/>
-        </w:rPr>
-        <w:t>.</w:t>
-      </w:r>
-    </w:p>
-    <w:p>
-      <w:pPr>
-        <w:pStyle w:val="ListParagraph"/>
-        <w:numPr>
-          <w:ilvl w:val="0"/>
-          <w:numId w:val="8"/>
-        </w:numPr>
-        <w:rPr>
-          <w:rFonts w:ascii="Segoe UI" w:hAnsi="Segoe UI" w:cs="Segoe UI"/>
-          <w:sz w:val="28"/>
-          <w:szCs w:val="28"/>
-          <w:lang w:val="fr-FR"/>
-        </w:rPr>
-      </w:pPr>
-      <w:r>
-        <w:rPr>
-          <w:rFonts w:ascii="Segoe UI" w:hAnsi="Segoe UI" w:cs="Segoe UI"/>
-          <w:sz w:val="28"/>
-          <w:szCs w:val="28"/>
-          <w:lang w:val="fr-FR"/>
-        </w:rPr>
-        <w:t>Présentation du</w:t>
-      </w:r>
-      <w:r>
-        <w:rPr>
-          <w:rFonts w:ascii="Segoe UI" w:hAnsi="Segoe UI" w:cs="Segoe UI"/>
-          <w:sz w:val="28"/>
-          <w:szCs w:val="28"/>
-          <w:lang w:val="fr-FR"/>
-        </w:rPr>
-        <w:t xml:space="preserve"> projet</w:t>
-      </w:r>
-      <w:r>
-        <w:rPr>
-          <w:rFonts w:ascii="Segoe UI" w:hAnsi="Segoe UI" w:cs="Segoe UI"/>
-          <w:sz w:val="28"/>
-          <w:szCs w:val="28"/>
-          <w:lang w:val="fr-FR"/>
-        </w:rPr>
-        <w:t>.</w:t>
-      </w:r>
-    </w:p>
-    <w:p>
-      <w:pPr>
-        <w:rPr>
-          <w:rFonts w:ascii="ae_AlArabiya" w:hAnsi="ae_AlArabiya" w:cs="ae_AlArabiya"/>
-          <w:sz w:val="28"/>
-          <w:szCs w:val="28"/>
-          <w:lang w:val="fr-FR"/>
-        </w:rPr>
-      </w:pPr>
-    </w:p>
-    <w:p>
-      <w:pPr>
-        <w:rPr>
-          <w:rFonts w:ascii="ae_AlArabiya" w:hAnsi="ae_AlArabiya" w:cs="ae_AlArabiya"/>
-          <w:b/>
-          <w:bCs/>
-          <w:sz w:val="32"/>
-          <w:szCs w:val="32"/>
-          <w:lang w:val="fr-FR"/>
-        </w:rPr>
-      </w:pPr>
-      <w:r>
-        <w:rPr>
-          <w:rFonts w:ascii="ae_AlArabiya" w:hAnsi="ae_AlArabiya" w:cs="ae_AlArabiya"/>
-          <w:b/>
-          <w:bCs/>
-          <w:sz w:val="32"/>
-          <w:szCs w:val="32"/>
-          <w:lang w:val="fr-FR"/>
-        </w:rPr>
-        <w:t>Chapitre 2 : Gestion de projet.</w:t>
-      </w:r>
-    </w:p>
-    <w:p>
-      <w:pPr>
-        <w:pStyle w:val="ListParagraph"/>
-        <w:numPr>
-          <w:ilvl w:val="0"/>
-          <w:numId w:val="7"/>
-        </w:numPr>
-        <w:rPr>
-          <w:rFonts w:ascii="ae_AlArabiya" w:hAnsi="ae_AlArabiya" w:cs="ae_AlArabiya"/>
-          <w:sz w:val="28"/>
-          <w:szCs w:val="28"/>
-          <w:lang w:val="fr-FR"/>
-        </w:rPr>
-      </w:pPr>
-      <w:r>
-        <w:rPr>
-          <w:rFonts w:ascii="ae_AlArabiya" w:hAnsi="ae_AlArabiya" w:cs="ae_AlArabiya"/>
-          <w:sz w:val="28"/>
-          <w:szCs w:val="28"/>
-          <w:lang w:val="fr-FR"/>
-        </w:rPr>
-        <w:t xml:space="preserve">Diagramme de </w:t>
-      </w:r>
-      <w:r>
-        <w:rPr>
-          <w:rFonts w:ascii="ae_AlArabiya" w:hAnsi="ae_AlArabiya" w:cs="ae_AlArabiya"/>
-          <w:sz w:val="28"/>
-          <w:szCs w:val="28"/>
-          <w:lang w:val="fr-FR"/>
-        </w:rPr>
-        <w:t>PERT</w:t>
-      </w:r>
-      <w:r>
-        <w:rPr>
-          <w:rFonts w:ascii="ae_AlArabiya" w:hAnsi="ae_AlArabiya" w:cs="ae_AlArabiya"/>
-          <w:sz w:val="28"/>
-          <w:szCs w:val="28"/>
-          <w:lang w:val="fr-FR"/>
-        </w:rPr>
-        <w:t>.</w:t>
-      </w:r>
-    </w:p>
-    <w:p>
-      <w:pPr>
-        <w:pStyle w:val="ListParagraph"/>
-        <w:numPr>
-          <w:ilvl w:val="1"/>
-          <w:numId w:val="7"/>
-        </w:numPr>
-        <w:rPr>
-          <w:rFonts w:ascii="ae_AlArabiya" w:hAnsi="ae_AlArabiya" w:cs="ae_AlArabiya"/>
-          <w:sz w:val="28"/>
-          <w:szCs w:val="28"/>
-          <w:lang w:val="fr-FR"/>
-        </w:rPr>
-      </w:pPr>
-      <w:r>
-        <w:rPr>
-          <w:rFonts w:ascii="ae_AlArabiya" w:hAnsi="ae_AlArabiya" w:cs="ae_AlArabiya"/>
-          <w:sz w:val="28"/>
-          <w:szCs w:val="28"/>
-          <w:lang w:val="fr-FR"/>
-        </w:rPr>
-        <w:t xml:space="preserve">Identifier </w:t>
-      </w:r>
-      <w:r>
-        <w:rPr>
-          <w:rFonts w:ascii="ae_AlArabiya" w:hAnsi="ae_AlArabiya" w:cs="ae_AlArabiya"/>
-          <w:sz w:val="28"/>
-          <w:szCs w:val="28"/>
-          <w:lang w:val="fr-FR"/>
-        </w:rPr>
-        <w:t>l</w:t>
-      </w:r>
-      <w:r>
-        <w:rPr>
-          <w:rFonts w:ascii="ae_AlArabiya" w:hAnsi="ae_AlArabiya" w:cs="ae_AlArabiya"/>
-          <w:sz w:val="28"/>
-          <w:szCs w:val="28"/>
-          <w:lang w:val="fr-FR"/>
-        </w:rPr>
-        <w:t>es taches.</w:t>
-      </w:r>
-    </w:p>
-    <w:p>
-      <w:pPr>
-        <w:pStyle w:val="ListParagraph"/>
-        <w:numPr>
-          <w:ilvl w:val="1"/>
-          <w:numId w:val="7"/>
-        </w:numPr>
-        <w:rPr>
-          <w:rFonts w:ascii="ae_AlArabiya" w:hAnsi="ae_AlArabiya" w:cs="ae_AlArabiya"/>
-          <w:sz w:val="28"/>
-          <w:szCs w:val="28"/>
-          <w:lang w:val="fr-FR"/>
-        </w:rPr>
-      </w:pPr>
-      <w:r>
-        <w:rPr>
-          <w:rFonts w:ascii="ae_AlArabiya" w:hAnsi="ae_AlArabiya" w:cs="ae_AlArabiya"/>
-          <w:sz w:val="28"/>
-          <w:szCs w:val="28"/>
-          <w:lang w:val="fr-FR"/>
-        </w:rPr>
-        <w:t>Graphe PERT</w:t>
-      </w:r>
-      <w:r>
-        <w:rPr>
-          <w:rFonts w:ascii="ae_AlArabiya" w:hAnsi="ae_AlArabiya" w:cs="ae_AlArabiya"/>
-          <w:sz w:val="28"/>
-          <w:szCs w:val="28"/>
-          <w:lang w:val="fr-FR"/>
-        </w:rPr>
-        <w:t xml:space="preserve"> Probabiliste</w:t>
-      </w:r>
-      <w:r>
-        <w:rPr>
-          <w:rFonts w:ascii="ae_AlArabiya" w:hAnsi="ae_AlArabiya" w:cs="ae_AlArabiya"/>
-          <w:sz w:val="28"/>
-          <w:szCs w:val="28"/>
-          <w:lang w:val="fr-FR"/>
-        </w:rPr>
-        <w:t>.</w:t>
-      </w:r>
-    </w:p>
-    <w:p>
-      <w:pPr>
-        <w:pStyle w:val="ListParagraph"/>
-        <w:numPr>
-          <w:ilvl w:val="1"/>
-          <w:numId w:val="7"/>
-        </w:numPr>
-        <w:rPr>
-          <w:rFonts w:ascii="ae_AlArabiya" w:hAnsi="ae_AlArabiya" w:cs="ae_AlArabiya"/>
-          <w:sz w:val="28"/>
-          <w:szCs w:val="28"/>
-          <w:lang w:val="fr-FR"/>
-        </w:rPr>
-      </w:pPr>
-      <w:r>
-        <w:rPr>
-          <w:rFonts w:ascii="ae_AlArabiya" w:hAnsi="ae_AlArabiya" w:cs="ae_AlArabiya"/>
-          <w:sz w:val="28"/>
-          <w:szCs w:val="28"/>
-          <w:lang w:val="fr-FR"/>
-        </w:rPr>
-        <w:t>Chemin Critique.</w:t>
-      </w:r>
-    </w:p>
-    <w:p>
-      <w:pPr>
-        <w:pStyle w:val="ListParagraph"/>
-        <w:numPr>
-          <w:ilvl w:val="0"/>
-          <w:numId w:val="7"/>
-        </w:numPr>
-        <w:rPr>
-          <w:rFonts w:ascii="ae_AlArabiya" w:hAnsi="ae_AlArabiya" w:cs="ae_AlArabiya"/>
-          <w:sz w:val="28"/>
-          <w:szCs w:val="28"/>
-          <w:lang w:val="fr-FR"/>
-        </w:rPr>
-      </w:pPr>
-      <w:r>
-        <w:rPr>
-          <w:rFonts w:ascii="ae_AlArabiya" w:hAnsi="ae_AlArabiya" w:cs="ae_AlArabiya"/>
-          <w:sz w:val="28"/>
-          <w:szCs w:val="28"/>
-          <w:lang w:val="fr-FR"/>
-        </w:rPr>
-        <w:t>D</w:t>
-      </w:r>
-      <w:r>
-        <w:rPr>
-          <w:rFonts w:ascii="ae_AlArabiya" w:hAnsi="ae_AlArabiya" w:cs="ae_AlArabiya"/>
-          <w:sz w:val="28"/>
-          <w:szCs w:val="28"/>
-          <w:lang w:val="fr-FR"/>
-        </w:rPr>
-        <w:t>iagramme de GANTT</w:t>
-      </w:r>
-      <w:r>
-        <w:rPr>
-          <w:rFonts w:ascii="ae_AlArabiya" w:hAnsi="ae_AlArabiya" w:cs="ae_AlArabiya"/>
-          <w:sz w:val="28"/>
-          <w:szCs w:val="28"/>
-          <w:lang w:val="fr-FR"/>
-        </w:rPr>
-        <w:t>.</w:t>
-      </w:r>
-    </w:p>
-    <w:p>
-      <w:pPr>
-        <w:pStyle w:val="ListParagraph"/>
-        <w:numPr>
-          <w:ilvl w:val="0"/>
-          <w:numId w:val="7"/>
-        </w:numPr>
-        <w:rPr>
-          <w:rFonts w:ascii="ae_AlArabiya" w:hAnsi="ae_AlArabiya" w:cs="ae_AlArabiya"/>
-          <w:sz w:val="28"/>
-          <w:szCs w:val="28"/>
-          <w:lang w:val="fr-FR"/>
-        </w:rPr>
-      </w:pPr>
-      <w:r>
-        <w:rPr>
-          <w:rFonts w:ascii="ae_AlArabiya" w:hAnsi="ae_AlArabiya" w:cs="ae_AlArabiya"/>
-          <w:sz w:val="28"/>
-          <w:szCs w:val="28"/>
-          <w:lang w:val="fr-FR"/>
-        </w:rPr>
-        <w:t>Estimation des charges.</w:t>
-      </w:r>
-    </w:p>
-    <w:p>
-      <w:pPr>
-        <w:rPr>
-          <w:rFonts w:ascii="ae_AlArabiya" w:hAnsi="ae_AlArabiya" w:cs="ae_AlArabiya"/>
-          <w:sz w:val="28"/>
-          <w:szCs w:val="28"/>
-          <w:lang w:val="fr-FR"/>
-        </w:rPr>
-      </w:pPr>
-    </w:p>
-    <w:p>
-      <w:pPr>
-        <w:rPr>
-          <w:rFonts w:ascii="ae_AlArabiya" w:hAnsi="ae_AlArabiya" w:cs="ae_AlArabiya"/>
-          <w:b/>
-          <w:bCs/>
-          <w:sz w:val="32"/>
-          <w:szCs w:val="32"/>
-          <w:lang w:val="fr-FR"/>
-        </w:rPr>
-      </w:pPr>
-      <w:r>
-        <w:rPr>
-          <w:rFonts w:ascii="ae_AlArabiya" w:hAnsi="ae_AlArabiya" w:cs="ae_AlArabiya"/>
-          <w:b/>
-          <w:bCs/>
-          <w:sz w:val="32"/>
-          <w:szCs w:val="32"/>
-          <w:lang w:val="fr-FR"/>
-        </w:rPr>
-        <w:t>Chapitre 3 : Conception.</w:t>
-      </w:r>
-    </w:p>
-    <w:p>
-      <w:pPr>
-        <w:pStyle w:val="ListParagraph"/>
-        <w:numPr>
-          <w:ilvl w:val="0"/>
-          <w:numId w:val="7"/>
-        </w:numPr>
-        <w:rPr>
-          <w:rFonts w:ascii="ae_AlArabiya" w:hAnsi="ae_AlArabiya" w:cs="ae_AlArabiya"/>
-          <w:sz w:val="28"/>
-          <w:szCs w:val="28"/>
-          <w:lang w:val="fr-FR"/>
-        </w:rPr>
-      </w:pPr>
-      <w:r>
-        <w:rPr>
-          <w:rFonts w:ascii="ae_AlArabiya" w:hAnsi="ae_AlArabiya" w:cs="ae_AlArabiya"/>
-          <w:sz w:val="28"/>
-          <w:szCs w:val="28"/>
-          <w:lang w:val="fr-FR"/>
-        </w:rPr>
-        <w:t xml:space="preserve">Diagramme </w:t>
-      </w:r>
-      <w:r>
-        <w:rPr>
-          <w:rFonts w:ascii="ae_AlArabiya" w:hAnsi="ae_AlArabiya" w:cs="ae_AlArabiya"/>
-          <w:sz w:val="28"/>
-          <w:szCs w:val="28"/>
-          <w:lang w:val="fr-FR"/>
-        </w:rPr>
-        <w:t>de cas d’utilisation.</w:t>
-      </w:r>
-    </w:p>
-    <w:p>
-      <w:pPr>
-        <w:pStyle w:val="ListParagraph"/>
-        <w:numPr>
-          <w:ilvl w:val="0"/>
-          <w:numId w:val="7"/>
-        </w:numPr>
-        <w:rPr>
-          <w:rFonts w:ascii="ae_AlArabiya" w:hAnsi="ae_AlArabiya" w:cs="ae_AlArabiya"/>
-          <w:sz w:val="28"/>
-          <w:szCs w:val="28"/>
-          <w:lang w:val="fr-FR"/>
-        </w:rPr>
-      </w:pPr>
-      <w:r>
-        <w:rPr>
-          <w:rFonts w:ascii="ae_AlArabiya" w:hAnsi="ae_AlArabiya" w:cs="ae_AlArabiya"/>
-          <w:sz w:val="28"/>
-          <w:szCs w:val="28"/>
-          <w:lang w:val="fr-FR"/>
-        </w:rPr>
-        <w:t xml:space="preserve">Diagramme de </w:t>
-      </w:r>
-      <w:r>
-        <w:rPr>
-          <w:rFonts w:ascii="ae_AlArabiya" w:hAnsi="ae_AlArabiya" w:cs="ae_AlArabiya"/>
-          <w:sz w:val="28"/>
-          <w:szCs w:val="28"/>
-          <w:lang w:val="fr-FR"/>
-        </w:rPr>
-        <w:t>séquence.</w:t>
-      </w:r>
-    </w:p>
-    <w:p>
-      <w:pPr>
-        <w:pStyle w:val="ListParagraph"/>
-        <w:numPr>
-          <w:ilvl w:val="0"/>
-          <w:numId w:val="7"/>
-        </w:numPr>
-        <w:rPr>
-          <w:rFonts w:ascii="ae_AlArabiya" w:hAnsi="ae_AlArabiya" w:cs="ae_AlArabiya"/>
-          <w:sz w:val="28"/>
-          <w:szCs w:val="28"/>
-          <w:lang w:val="fr-FR"/>
-        </w:rPr>
-      </w:pPr>
-      <w:r>
-        <w:rPr>
-          <w:rFonts w:ascii="ae_AlArabiya" w:hAnsi="ae_AlArabiya" w:cs="ae_AlArabiya"/>
-          <w:sz w:val="28"/>
-          <w:szCs w:val="28"/>
-          <w:lang w:val="fr-FR"/>
-        </w:rPr>
-        <w:t>Diagramme de classes.</w:t>
-      </w:r>
-    </w:p>
-    <w:p>
-      <w:pPr>
-        <w:pStyle w:val="ListParagraph"/>
-        <w:numPr>
-          <w:ilvl w:val="0"/>
-          <w:numId w:val="7"/>
-        </w:numPr>
-        <w:rPr>
-          <w:rFonts w:ascii="ae_AlArabiya" w:hAnsi="ae_AlArabiya" w:cs="ae_AlArabiya"/>
-          <w:sz w:val="28"/>
-          <w:szCs w:val="28"/>
-          <w:lang w:val="fr-FR"/>
-        </w:rPr>
-      </w:pPr>
-      <w:r>
-        <w:rPr>
-          <w:rFonts w:ascii="ae_AlArabiya" w:hAnsi="ae_AlArabiya" w:cs="ae_AlArabiya"/>
-          <w:sz w:val="28"/>
-          <w:szCs w:val="28"/>
-          <w:lang w:val="fr-FR"/>
-        </w:rPr>
-        <w:t>Diagramme d’activité.</w:t>
-      </w:r>
-    </w:p>
-    <w:p>
-      <w:pPr>
-        <w:pStyle w:val="ListParagraph"/>
-        <w:numPr>
-          <w:ilvl w:val="0"/>
-          <w:numId w:val="7"/>
-        </w:numPr>
-        <w:rPr>
-          <w:rFonts w:ascii="ae_AlArabiya" w:hAnsi="ae_AlArabiya" w:cs="ae_AlArabiya"/>
-          <w:sz w:val="28"/>
-          <w:szCs w:val="28"/>
-          <w:lang w:val="fr-FR"/>
-        </w:rPr>
-      </w:pPr>
-      <w:r>
-        <w:rPr>
-          <w:rFonts w:ascii="ae_AlArabiya" w:hAnsi="ae_AlArabiya" w:cs="ae_AlArabiya"/>
-          <w:sz w:val="28"/>
-          <w:szCs w:val="28"/>
-          <w:lang w:val="fr-FR"/>
-        </w:rPr>
-        <w:t>Diagramme de collaboration.</w:t>
-      </w:r>
-    </w:p>
-    <w:p>
-      <w:pPr>
-        <w:pStyle w:val="ListParagraph"/>
-        <w:numPr>
-          <w:ilvl w:val="0"/>
-          <w:numId w:val="7"/>
-        </w:numPr>
-        <w:rPr>
-          <w:rFonts w:ascii="ae_AlArabiya" w:hAnsi="ae_AlArabiya" w:cs="ae_AlArabiya"/>
-          <w:sz w:val="28"/>
-          <w:szCs w:val="28"/>
-          <w:lang w:val="fr-FR"/>
-        </w:rPr>
-      </w:pPr>
-      <w:r>
-        <w:rPr>
-          <w:rFonts w:ascii="ae_AlArabiya" w:hAnsi="ae_AlArabiya" w:cs="ae_AlArabiya"/>
-          <w:sz w:val="28"/>
-          <w:szCs w:val="28"/>
-          <w:lang w:val="fr-FR"/>
-        </w:rPr>
-        <w:t>Diagramme d’état.</w:t>
-      </w:r>
-    </w:p>
-    <w:p>
-      <w:pPr>
-        <w:pStyle w:val="ListParagraph"/>
-        <w:rPr>
-          <w:rFonts w:ascii="ae_AlArabiya" w:hAnsi="ae_AlArabiya" w:cs="ae_AlArabiya"/>
-          <w:sz w:val="28"/>
-          <w:szCs w:val="28"/>
-          <w:lang w:val="fr-FR"/>
-        </w:rPr>
-      </w:pPr>
-    </w:p>
-    <w:p>
-      <w:pPr>
-        <w:pStyle w:val="ListParagraph"/>
-        <w:rPr>
-          <w:rFonts w:ascii="ae_AlArabiya" w:hAnsi="ae_AlArabiya" w:cs="ae_AlArabiya"/>
-          <w:sz w:val="28"/>
-          <w:szCs w:val="28"/>
-          <w:lang w:val="fr-FR"/>
-        </w:rPr>
-      </w:pPr>
-    </w:p>
-    <w:p>
-      <w:pPr>
-        <w:pStyle w:val="ListParagraph"/>
-        <w:rPr>
-          <w:rFonts w:ascii="ae_AlArabiya" w:hAnsi="ae_AlArabiya" w:cs="ae_AlArabiya"/>
-          <w:sz w:val="28"/>
-          <w:szCs w:val="28"/>
-          <w:lang w:val="fr-FR"/>
-        </w:rPr>
-      </w:pPr>
-    </w:p>
-    <w:p>
-      <w:pPr>
-        <w:pStyle w:val="ListParagraph"/>
-        <w:rPr>
-          <w:rFonts w:ascii="ae_AlArabiya" w:hAnsi="ae_AlArabiya" w:cs="ae_AlArabiya"/>
-          <w:sz w:val="28"/>
-          <w:szCs w:val="28"/>
-          <w:lang w:val="fr-FR"/>
-        </w:rPr>
-      </w:pPr>
-    </w:p>
-    <w:p>
-      <w:pPr>
-        <w:pStyle w:val="ListParagraph"/>
-        <w:rPr>
-          <w:rFonts w:ascii="ae_AlArabiya" w:hAnsi="ae_AlArabiya" w:cs="ae_AlArabiya"/>
-          <w:sz w:val="28"/>
-          <w:szCs w:val="28"/>
-          <w:lang w:val="fr-FR"/>
-        </w:rPr>
-      </w:pPr>
-    </w:p>
-    <w:p>
-      <w:pPr>
-        <w:pStyle w:val="ListParagraph"/>
-        <w:rPr>
-          <w:rFonts w:ascii="ae_AlArabiya" w:hAnsi="ae_AlArabiya" w:cs="ae_AlArabiya"/>
-          <w:sz w:val="40"/>
-          <w:szCs w:val="40"/>
-          <w:lang w:val="fr-FR"/>
-        </w:rPr>
-      </w:pPr>
-    </w:p>
-    <w:p>
-      <w:pPr>
-        <w:rPr>
-          <w:rFonts w:ascii="Segoe UI" w:hAnsi="Segoe UI" w:cs="Segoe UI"/>
-          <w:sz w:val="44"/>
-          <w:szCs w:val="44"/>
-          <w:lang w:val="fr-FR"/>
-        </w:rPr>
-      </w:pPr>
-      <w:r>
-        <w:rPr>
-          <w:rFonts w:ascii="Segoe UI" w:hAnsi="Segoe UI" w:cs="Segoe UI"/>
-          <w:b/>
-          <w:bCs/>
-          <w:color w:val="2E74B5" w:themeColor="accent1" w:themeShade="BF"/>
-          <w:sz w:val="44"/>
-          <w:szCs w:val="44"/>
-          <w:lang w:val="fr-FR"/>
-        </w:rPr>
-        <w:t xml:space="preserve">Chapitre 1 : </w:t>
-      </w:r>
-      <w:r>
-        <w:rPr>
-          <w:rFonts w:ascii="Segoe UI" w:hAnsi="Segoe UI" w:cs="Segoe UI"/>
-          <w:b/>
-          <w:bCs/>
-          <w:color w:val="2E74B5" w:themeColor="accent1" w:themeShade="BF"/>
-          <w:sz w:val="44"/>
-          <w:szCs w:val="44"/>
-          <w:lang w:val="fr-FR"/>
-        </w:rPr>
-        <w:t>Introduction Générale</w:t>
-      </w:r>
-      <w:r>
-        <w:rPr>
-          <w:rFonts w:ascii="Segoe UI" w:hAnsi="Segoe UI" w:cs="Segoe UI"/>
-          <w:color w:val="2E74B5" w:themeColor="accent1" w:themeShade="BF"/>
-          <w:sz w:val="44"/>
-          <w:szCs w:val="44"/>
-          <w:lang w:val="fr-FR"/>
-        </w:rPr>
-        <w:t>.</w:t>
-      </w:r>
-    </w:p>
-    <w:p>
-      <w:pPr>
-        <w:rPr>
-          <w:rFonts w:ascii="ae_AlArabiya" w:hAnsi="ae_AlArabiya" w:cs="ae_AlArabiya"/>
-          <w:sz w:val="40"/>
-          <w:szCs w:val="40"/>
-          <w:lang w:val="fr-FR"/>
-        </w:rPr>
-      </w:pPr>
-    </w:p>
-    <w:p>
-      <w:pPr>
-        <w:pStyle w:val="ListParagraph"/>
-        <w:numPr>
-          <w:ilvl w:val="0"/>
-          <w:numId w:val="9"/>
-        </w:numPr>
-        <w:rPr>
-          <w:rFonts w:ascii="ae_AlArabiya" w:hAnsi="ae_AlArabiya" w:cs="ae_AlArabiya"/>
-          <w:b/>
-          <w:bCs/>
-          <w:sz w:val="32"/>
-          <w:szCs w:val="32"/>
-          <w:lang w:val="fr-FR"/>
-        </w:rPr>
-      </w:pPr>
-      <w:r>
-        <w:rPr>
-          <w:rFonts w:ascii="ae_AlArabiya" w:hAnsi="ae_AlArabiya" w:cs="ae_AlArabiya"/>
-          <w:b/>
-          <w:bCs/>
-          <w:color w:val="FF0000"/>
-          <w:sz w:val="32"/>
-          <w:szCs w:val="32"/>
-          <w:lang w:val="fr-FR"/>
-        </w:rPr>
-        <w:t>Remerciement</w:t>
-      </w:r>
-      <w:r>
-        <w:rPr>
-          <w:rFonts w:ascii="ae_AlArabiya" w:hAnsi="ae_AlArabiya" w:cs="ae_AlArabiya"/>
-          <w:b/>
-          <w:bCs/>
-          <w:sz w:val="32"/>
-          <w:szCs w:val="32"/>
-          <w:lang w:val="fr-FR"/>
-        </w:rPr>
-        <w:t>.</w:t>
-      </w:r>
-    </w:p>
-    <w:p>
-      <w:pPr>
-        <w:rPr>
-          <w:rFonts w:ascii="ae_AlArabiya" w:hAnsi="ae_AlArabiya" w:cs="ae_AlArabiya"/>
-          <w:sz w:val="28"/>
-          <w:szCs w:val="28"/>
-          <w:lang w:val="fr-FR"/>
-        </w:rPr>
-      </w:pPr>
-      <w:r>
-        <w:rPr>
-          <w:rFonts w:ascii="ae_AlArabiya" w:hAnsi="ae_AlArabiya" w:cs="ae_AlArabiya"/>
-          <w:sz w:val="28"/>
-          <w:szCs w:val="28"/>
-          <w:lang w:val="fr-FR"/>
-        </w:rPr>
-        <w:t>Nous</w:t>
-      </w:r>
-      <w:r>
-        <w:rPr>
-          <w:rFonts w:ascii="ae_AlArabiya" w:hAnsi="ae_AlArabiya" w:cs="ae_AlArabiya"/>
-          <w:sz w:val="28"/>
-          <w:szCs w:val="28"/>
-          <w:lang w:val="fr-FR"/>
-        </w:rPr>
-        <w:t xml:space="preserve"> </w:t>
-      </w:r>
-      <w:r>
-        <w:rPr>
-          <w:rFonts w:ascii="ae_AlArabiya" w:hAnsi="ae_AlArabiya" w:cs="ae_AlArabiya"/>
-          <w:sz w:val="28"/>
-          <w:szCs w:val="28"/>
-          <w:lang w:val="fr-FR"/>
-        </w:rPr>
-        <w:t>te</w:t>
-      </w:r>
-      <w:r>
-        <w:rPr>
-          <w:rFonts w:ascii="ae_AlArabiya" w:hAnsi="ae_AlArabiya" w:cs="ae_AlArabiya"/>
-          <w:sz w:val="28"/>
-          <w:szCs w:val="28"/>
-          <w:lang w:val="fr-FR"/>
-        </w:rPr>
-        <w:t>n</w:t>
-      </w:r>
-      <w:r>
-        <w:rPr>
-          <w:rFonts w:ascii="ae_AlArabiya" w:hAnsi="ae_AlArabiya" w:cs="ae_AlArabiya"/>
-          <w:sz w:val="28"/>
-          <w:szCs w:val="28"/>
-          <w:lang w:val="fr-FR"/>
-        </w:rPr>
-        <w:t>on</w:t>
-      </w:r>
-      <w:r>
-        <w:rPr>
-          <w:rFonts w:ascii="ae_AlArabiya" w:hAnsi="ae_AlArabiya" w:cs="ae_AlArabiya"/>
-          <w:sz w:val="28"/>
-          <w:szCs w:val="28"/>
-          <w:lang w:val="fr-FR"/>
-        </w:rPr>
-        <w:t>s à remercier particulièrement Monsieur Souhaib et Monsieur Berich Pour nous accompa</w:t>
-      </w:r>
-      <w:r>
-        <w:rPr>
-          <w:rFonts w:ascii="ae_AlArabiya" w:hAnsi="ae_AlArabiya" w:cs="ae_AlArabiya"/>
-          <w:sz w:val="28"/>
-          <w:szCs w:val="28"/>
-          <w:lang w:val="fr-FR"/>
-        </w:rPr>
-        <w:t>gner durant ce projet, et nous don</w:t>
-      </w:r>
-      <w:r>
-        <w:rPr>
-          <w:rFonts w:ascii="ae_AlArabiya" w:hAnsi="ae_AlArabiya" w:cs="ae_AlArabiya"/>
-          <w:sz w:val="28"/>
-          <w:szCs w:val="28"/>
-          <w:lang w:val="fr-FR"/>
-        </w:rPr>
-        <w:t>n</w:t>
-      </w:r>
-      <w:r>
-        <w:rPr>
-          <w:rFonts w:ascii="ae_AlArabiya" w:hAnsi="ae_AlArabiya" w:cs="ae_AlArabiya"/>
-          <w:sz w:val="28"/>
-          <w:szCs w:val="28"/>
-          <w:lang w:val="fr-FR"/>
-        </w:rPr>
-        <w:t xml:space="preserve">er des conseils et des astuces que ça soit les missions évoquées </w:t>
-      </w:r>
-      <w:r>
-        <w:rPr>
-          <w:rFonts w:ascii="ae_AlArabiya" w:hAnsi="ae_AlArabiya" w:cs="ae_AlArabiya"/>
-          <w:sz w:val="28"/>
-          <w:szCs w:val="28"/>
-          <w:lang w:val="fr-FR"/>
-        </w:rPr>
-        <w:t>de gestion du</w:t>
-      </w:r>
-      <w:r>
-        <w:rPr>
-          <w:rFonts w:ascii="ae_AlArabiya" w:hAnsi="ae_AlArabiya" w:cs="ae_AlArabiya"/>
-          <w:sz w:val="28"/>
-          <w:szCs w:val="28"/>
-          <w:lang w:val="fr-FR"/>
-        </w:rPr>
-        <w:t xml:space="preserve"> projet</w:t>
-      </w:r>
-      <w:r>
-        <w:rPr>
-          <w:rFonts w:ascii="ae_AlArabiya" w:hAnsi="ae_AlArabiya" w:cs="ae_AlArabiya"/>
-          <w:sz w:val="28"/>
-          <w:szCs w:val="28"/>
-          <w:lang w:val="fr-FR"/>
-        </w:rPr>
-        <w:t>,</w:t>
-      </w:r>
-      <w:r>
-        <w:rPr>
-          <w:rFonts w:ascii="ae_AlArabiya" w:hAnsi="ae_AlArabiya" w:cs="ae_AlArabiya"/>
-          <w:sz w:val="28"/>
-          <w:szCs w:val="28"/>
-          <w:lang w:val="fr-FR"/>
-        </w:rPr>
-        <w:t xml:space="preserve"> ou les missions concernant la conception UML.</w:t>
-      </w:r>
-    </w:p>
-    <w:p>
-      <w:pPr>
-        <w:rPr>
-          <w:rFonts w:ascii="ae_AlArabiya" w:hAnsi="ae_AlArabiya" w:cs="ae_AlArabiya"/>
-          <w:sz w:val="40"/>
-          <w:szCs w:val="40"/>
-          <w:lang w:val="fr-FR"/>
-        </w:rPr>
-      </w:pPr>
-    </w:p>
-    <w:p>
-      <w:pPr>
-        <w:pStyle w:val="ListParagraph"/>
-        <w:numPr>
-          <w:ilvl w:val="0"/>
-          <w:numId w:val="9"/>
-        </w:numPr>
-        <w:rPr>
-          <w:rFonts w:ascii="ae_AlArabiya" w:hAnsi="ae_AlArabiya" w:cs="ae_AlArabiya"/>
-          <w:b/>
-          <w:bCs/>
-          <w:sz w:val="32"/>
-          <w:szCs w:val="32"/>
-          <w:lang w:val="fr-FR"/>
-        </w:rPr>
-      </w:pPr>
-      <w:r>
-        <w:rPr>
-          <w:rFonts w:ascii="ae_AlArabiya" w:hAnsi="ae_AlArabiya" w:cs="ae_AlArabiya"/>
-          <w:b/>
-          <w:bCs/>
-          <w:color w:val="FF0000"/>
-          <w:sz w:val="32"/>
-          <w:szCs w:val="32"/>
-          <w:lang w:val="fr-FR"/>
-        </w:rPr>
-        <w:t>Résumé.</w:t>
-      </w:r>
-    </w:p>
-    <w:p>
-      <w:pPr>
-        <w:rPr>
-          <w:rFonts w:ascii="ae_AlArabiya" w:hAnsi="ae_AlArabiya" w:cs="ae_AlArabiya"/>
-          <w:sz w:val="28"/>
-          <w:szCs w:val="28"/>
-          <w:lang w:val="fr-FR"/>
-        </w:rPr>
-      </w:pPr>
-      <w:r>
-        <w:rPr>
-          <w:rFonts w:ascii="ae_AlArabiya" w:hAnsi="ae_AlArabiya" w:cs="ae_AlArabiya"/>
-          <w:sz w:val="28"/>
-          <w:szCs w:val="28"/>
-          <w:lang w:val="fr-FR"/>
-        </w:rPr>
-        <w:t>La réalisation de ce mini projet a été une bonne occasion pour nous d’une part d’assimiler les différents outils acquis durant ce semestre,</w:t>
-      </w:r>
-      <w:r>
-        <w:rPr>
-          <w:rFonts w:ascii="ae_AlArabiya" w:hAnsi="ae_AlArabiya" w:cs="ae_AlArabiya"/>
-          <w:sz w:val="28"/>
-          <w:szCs w:val="28"/>
-          <w:lang w:val="fr-FR"/>
-        </w:rPr>
-        <w:t xml:space="preserve"> </w:t>
-      </w:r>
-      <w:r>
-        <w:rPr>
-          <w:rFonts w:ascii="ae_AlArabiya" w:hAnsi="ae_AlArabiya" w:cs="ae_AlArabiya"/>
-          <w:sz w:val="28"/>
-          <w:szCs w:val="28"/>
-          <w:lang w:val="fr-FR"/>
-        </w:rPr>
-        <w:t xml:space="preserve">et aussi d’acquérir des nouvelles </w:t>
-      </w:r>
-      <w:r>
-        <w:rPr>
-          <w:rFonts w:ascii="ae_AlArabiya" w:hAnsi="ae_AlArabiya" w:cs="ae_AlArabiya"/>
-          <w:sz w:val="28"/>
-          <w:szCs w:val="28"/>
-          <w:lang w:val="fr-FR"/>
-        </w:rPr>
-        <w:t xml:space="preserve">connaissances et des techniques d’une façon </w:t>
-      </w:r>
-      <w:r>
-        <w:rPr>
-          <w:rFonts w:ascii="ae_AlArabiya" w:hAnsi="ae_AlArabiya" w:cs="ae_AlArabiya"/>
-          <w:sz w:val="28"/>
-          <w:szCs w:val="28"/>
-          <w:lang w:val="fr-FR"/>
-        </w:rPr>
-        <w:t>professionnelle</w:t>
-      </w:r>
-      <w:r>
-        <w:rPr>
-          <w:rFonts w:ascii="ae_AlArabiya" w:hAnsi="ae_AlArabiya" w:cs="ae_AlArabiya"/>
-          <w:sz w:val="28"/>
-          <w:szCs w:val="28"/>
-          <w:lang w:val="fr-FR"/>
-        </w:rPr>
-        <w:t>.</w:t>
-      </w:r>
-    </w:p>
-    <w:p>
-      <w:pPr>
-        <w:rPr>
-          <w:rFonts w:ascii="ae_AlArabiya" w:hAnsi="ae_AlArabiya" w:cs="ae_AlArabiya"/>
-          <w:sz w:val="40"/>
-          <w:szCs w:val="40"/>
-          <w:lang w:val="fr-FR"/>
-        </w:rPr>
-      </w:pPr>
-    </w:p>
-    <w:p>
-      <w:pPr>
-        <w:pStyle w:val="ListParagraph"/>
-        <w:numPr>
-          <w:ilvl w:val="0"/>
-          <w:numId w:val="9"/>
-        </w:numPr>
-        <w:rPr>
-          <w:rFonts w:ascii="ae_AlArabiya" w:hAnsi="ae_AlArabiya" w:cs="ae_AlArabiya"/>
-          <w:b/>
-          <w:bCs/>
-          <w:sz w:val="32"/>
-          <w:szCs w:val="32"/>
-          <w:lang w:val="fr-FR"/>
-        </w:rPr>
-      </w:pPr>
-      <w:r>
-        <w:rPr>
-          <w:rFonts w:ascii="ae_AlArabiya" w:hAnsi="ae_AlArabiya" w:cs="ae_AlArabiya"/>
-          <w:b/>
-          <w:bCs/>
-          <w:color w:val="FF0000"/>
-          <w:sz w:val="32"/>
-          <w:szCs w:val="32"/>
-          <w:lang w:val="fr-FR"/>
-        </w:rPr>
-        <w:t>Présentation de projet.</w:t>
-      </w:r>
-    </w:p>
-    <w:p>
-      <w:pPr>
-        <w:rPr>
-          <w:rFonts w:ascii="ae_AlArabiya" w:hAnsi="ae_AlArabiya" w:cs="ae_AlArabiya"/>
-          <w:sz w:val="28"/>
-          <w:szCs w:val="28"/>
-          <w:lang w:val="fr-FR"/>
-        </w:rPr>
-      </w:pPr>
-      <w:r>
-        <w:rPr>
-          <w:rFonts w:ascii="ae_AlArabiya" w:hAnsi="ae_AlArabiya" w:cs="ae_AlArabiya"/>
-          <w:sz w:val="28"/>
-          <w:szCs w:val="28"/>
-          <w:lang w:val="fr-FR"/>
-        </w:rPr>
-        <w:t>Le Principe mission de ce projet est de réaliser une application JAVA Client-serveur qui permet d’un ou plusieurs clients d’interagir avec un serveur en utilisant les sockets.</w:t>
-      </w:r>
-    </w:p>
-    <w:p>
-      <w:pPr>
-        <w:rPr>
-          <w:rFonts w:ascii="ae_AlArabiya" w:hAnsi="ae_AlArabiya" w:cs="ae_AlArabiya"/>
-          <w:sz w:val="28"/>
-          <w:szCs w:val="28"/>
-          <w:lang w:val="fr-FR"/>
-        </w:rPr>
-      </w:pPr>
-      <w:r>
-        <w:rPr>
-          <w:rFonts w:ascii="ae_AlArabiya" w:hAnsi="ae_AlArabiya" w:cs="ae_AlArabiya"/>
-          <w:sz w:val="28"/>
-          <w:szCs w:val="28"/>
-          <w:lang w:val="fr-FR"/>
-        </w:rPr>
-        <w:t xml:space="preserve">L’application est sous forme d’un ancien jeu japonaise qu’il s’appelle « «, il permet à deux </w:t>
-      </w:r>
-      <w:r>
-        <w:rPr>
-          <w:rFonts w:ascii="ae_AlArabiya" w:hAnsi="ae_AlArabiya" w:cs="ae_AlArabiya"/>
-          <w:sz w:val="28"/>
-          <w:szCs w:val="28"/>
-          <w:lang w:val="fr-FR"/>
-        </w:rPr>
-        <w:t>clients</w:t>
-      </w:r>
-      <w:r>
-        <w:rPr>
-          <w:rFonts w:ascii="ae_AlArabiya" w:hAnsi="ae_AlArabiya" w:cs="ae_AlArabiya"/>
-          <w:sz w:val="28"/>
-          <w:szCs w:val="28"/>
-          <w:lang w:val="fr-FR"/>
-        </w:rPr>
-        <w:t xml:space="preserve"> de jouer entre eux à travers d’un serveur socket.</w:t>
-      </w:r>
-    </w:p>
-    <w:p>
-      <w:pPr>
-        <w:rPr>
-          <w:rFonts w:ascii="ae_AlArabiya" w:hAnsi="ae_AlArabiya" w:cs="ae_AlArabiya"/>
-          <w:sz w:val="40"/>
-          <w:szCs w:val="40"/>
-          <w:lang w:val="fr-FR"/>
-        </w:rPr>
-      </w:pPr>
-      <w:r>
-        <w:rPr>
-          <w:rFonts w:ascii="ae_AlArabiya" w:hAnsi="ae_AlArabiya" w:cs="ae_AlArabiya"/>
-          <w:sz w:val="40"/>
-          <w:szCs w:val="40"/>
-          <w:lang w:val="fr-FR"/>
-        </w:rPr>
-        <w:br w:type="page"/>
-      </w:r>
-    </w:p>
-    <w:p>
-      <w:pPr>
-        <w:rPr>
-          <w:rFonts w:ascii="Segoe UI" w:hAnsi="Segoe UI" w:cs="Segoe UI"/>
-          <w:b/>
-          <w:bCs/>
-          <w:color w:val="2E74B5" w:themeColor="accent1" w:themeShade="BF"/>
-          <w:sz w:val="44"/>
-          <w:szCs w:val="44"/>
-          <w:lang w:val="fr-FR"/>
-        </w:rPr>
-      </w:pPr>
-      <w:r>
-        <w:rPr>
-          <w:rFonts w:ascii="Segoe UI" w:hAnsi="Segoe UI" w:cs="Segoe UI"/>
-          <w:b/>
-          <w:bCs/>
-          <w:color w:val="2E74B5" w:themeColor="accent1" w:themeShade="BF"/>
-          <w:sz w:val="44"/>
-          <w:szCs w:val="44"/>
-          <w:lang w:val="fr-FR"/>
-        </w:rPr>
-        <w:lastRenderedPageBreak/>
-        <w:t xml:space="preserve">Chapitre 2 : </w:t>
-      </w:r>
-      <w:r>
-        <w:rPr>
-          <w:rFonts w:ascii="Segoe UI" w:hAnsi="Segoe UI" w:cs="Segoe UI"/>
-          <w:b/>
-          <w:bCs/>
-          <w:color w:val="2E74B5" w:themeColor="accent1" w:themeShade="BF"/>
-          <w:sz w:val="44"/>
-          <w:szCs w:val="44"/>
-          <w:lang w:val="fr-FR"/>
-        </w:rPr>
-        <w:t>Gestion du projet.</w:t>
-      </w:r>
-    </w:p>
-    <w:p>
-      <w:pPr>
-        <w:rPr>
-          <w:rFonts w:ascii="Segoe UI" w:hAnsi="Segoe UI" w:cs="Segoe UI"/>
-          <w:b/>
-          <w:bCs/>
-          <w:color w:val="2E74B5" w:themeColor="accent1" w:themeShade="BF"/>
-          <w:sz w:val="44"/>
-          <w:szCs w:val="44"/>
-          <w:lang w:val="fr-FR"/>
-        </w:rPr>
-      </w:pPr>
-    </w:p>
-    <w:p>
-      <w:pPr>
-        <w:pStyle w:val="ListParagraph"/>
-        <w:numPr>
-          <w:ilvl w:val="0"/>
-          <w:numId w:val="12"/>
-        </w:numPr>
-        <w:rPr>
-          <w:rFonts w:ascii="ae_AlArabiya" w:hAnsi="ae_AlArabiya" w:cs="ae_AlArabiya"/>
-          <w:b/>
-          <w:bCs/>
-          <w:sz w:val="32"/>
-          <w:szCs w:val="32"/>
-          <w:lang w:val="fr-FR"/>
-        </w:rPr>
-      </w:pPr>
-      <w:r>
-        <w:rPr>
-          <w:rFonts w:ascii="ae_AlArabiya" w:hAnsi="ae_AlArabiya" w:cs="ae_AlArabiya"/>
-          <w:b/>
-          <w:bCs/>
-          <w:color w:val="FF0000"/>
-          <w:sz w:val="32"/>
-          <w:szCs w:val="32"/>
-          <w:lang w:val="fr-FR"/>
-        </w:rPr>
-        <w:t xml:space="preserve">Diagramme de </w:t>
-      </w:r>
-      <w:r>
-        <w:rPr>
-          <w:rFonts w:ascii="ae_AlArabiya" w:hAnsi="ae_AlArabiya" w:cs="ae_AlArabiya"/>
-          <w:b/>
-          <w:bCs/>
-          <w:color w:val="FF0000"/>
-          <w:sz w:val="32"/>
-          <w:szCs w:val="32"/>
-          <w:lang w:val="fr-FR"/>
-        </w:rPr>
-        <w:t>PERT</w:t>
-      </w:r>
-      <w:r>
-        <w:rPr>
-          <w:rFonts w:ascii="ae_AlArabiya" w:hAnsi="ae_AlArabiya" w:cs="ae_AlArabiya"/>
-          <w:b/>
-          <w:bCs/>
-          <w:color w:val="FF0000"/>
-          <w:sz w:val="32"/>
-          <w:szCs w:val="32"/>
-          <w:lang w:val="fr-FR"/>
-        </w:rPr>
-        <w:t>.</w:t>
-      </w:r>
-    </w:p>
-    <w:p>
-      <w:pPr>
-        <w:pStyle w:val="ListParagraph"/>
-        <w:ind w:left="1080"/>
-        <w:rPr>
-          <w:rFonts w:ascii="ae_AlArabiya" w:hAnsi="ae_AlArabiya" w:cs="ae_AlArabiya"/>
-          <w:b/>
-          <w:bCs/>
-          <w:sz w:val="32"/>
-          <w:szCs w:val="32"/>
-          <w:lang w:val="fr-FR"/>
-        </w:rPr>
-      </w:pPr>
-    </w:p>
-    <w:p>
-      <w:pPr>
-        <w:pStyle w:val="ListParagraph"/>
-        <w:numPr>
-          <w:ilvl w:val="1"/>
-          <w:numId w:val="14"/>
-        </w:numPr>
+    </w:p>
+    <w:p>
+      <w:pPr>
+        <w:pStyle w:val="Heading2"/>
+        <w:ind w:firstLine="720"/>
+        <w:rPr>
+          <w:lang w:val="fr-FR"/>
+        </w:rPr>
+      </w:pPr>
+      <w:r>
+        <w:rPr>
+          <w:lang w:val="fr-FR"/>
+        </w:rPr>
+        <w:t xml:space="preserve">1-1 </w:t>
+      </w:r>
+      <w:r>
+        <w:rPr>
+          <w:lang w:val="fr-FR"/>
+        </w:rPr>
+        <w:t>Identifier les taches.</w:t>
+      </w:r>
+    </w:p>
+    <w:p>
+      <w:pPr>
+        <w:ind w:left="720"/>
         <w:rPr>
           <w:rFonts w:ascii="ae_AlArabiya" w:hAnsi="ae_AlArabiya" w:cs="ae_AlArabiya"/>
           <w:b/>
@@ -1670,51 +1571,26 @@
           <w:lang w:val="fr-FR"/>
         </w:rPr>
       </w:pPr>
-      <w:r>
-        <w:rPr>
-          <w:rFonts w:ascii="ae_AlArabiya" w:hAnsi="ae_AlArabiya" w:cs="ae_AlArabiya"/>
-          <w:b/>
-          <w:bCs/>
+    </w:p>
+    <w:p>
+      <w:pPr>
+        <w:rPr>
+          <w:rFonts w:ascii="ae_AlArabiya" w:hAnsi="ae_AlArabiya" w:cs="ae_AlArabiya"/>
           <w:color w:val="595959" w:themeColor="text1" w:themeTint="A6"/>
-          <w:sz w:val="32"/>
-          <w:szCs w:val="32"/>
-          <w:lang w:val="fr-FR"/>
-        </w:rPr>
-        <w:t>Identifier les taches.</w:t>
-      </w:r>
-    </w:p>
-    <w:p>
-      <w:pPr>
-        <w:ind w:left="720"/>
-        <w:rPr>
-          <w:rFonts w:ascii="ae_AlArabiya" w:hAnsi="ae_AlArabiya" w:cs="ae_AlArabiya"/>
-          <w:b/>
-          <w:bCs/>
+          <w:sz w:val="28"/>
+          <w:szCs w:val="28"/>
+          <w:lang w:val="fr-FR"/>
+        </w:rPr>
+      </w:pPr>
+      <w:r>
+        <w:rPr>
+          <w:rFonts w:ascii="ae_AlArabiya" w:hAnsi="ae_AlArabiya" w:cs="ae_AlArabiya"/>
           <w:color w:val="595959" w:themeColor="text1" w:themeTint="A6"/>
-          <w:sz w:val="32"/>
-          <w:szCs w:val="32"/>
-          <w:lang w:val="fr-FR"/>
-        </w:rPr>
-      </w:pPr>
-    </w:p>
-    <w:p>
-      <w:pPr>
-        <w:rPr>
-          <w:rFonts w:ascii="ae_AlArabiya" w:hAnsi="ae_AlArabiya" w:cs="ae_AlArabiya"/>
-          <w:color w:val="595959" w:themeColor="text1" w:themeTint="A6"/>
-          <w:sz w:val="28"/>
-          <w:szCs w:val="28"/>
-          <w:lang w:val="fr-FR"/>
-        </w:rPr>
-      </w:pPr>
-      <w:r>
-        <w:rPr>
-          <w:rFonts w:ascii="ae_AlArabiya" w:hAnsi="ae_AlArabiya" w:cs="ae_AlArabiya"/>
-          <w:color w:val="595959" w:themeColor="text1" w:themeTint="A6"/>
-          <w:sz w:val="28"/>
-          <w:szCs w:val="28"/>
-          <w:lang w:val="fr-FR"/>
-        </w:rPr>
+          <w:sz w:val="28"/>
+          <w:szCs w:val="28"/>
+          <w:lang w:val="fr-FR"/>
+        </w:rPr>
+        <w:lastRenderedPageBreak/>
         <w:pict>
           <v:shapetype id="_x0000_t75" coordsize="21600,21600" o:spt="75" o:preferrelative="t" path="m@4@5l@4@11@9@11@9@5xe" filled="f" stroked="f">
             <v:stroke joinstyle="miter"/>
@@ -1735,13 +1611,11 @@
             <v:path o:extrusionok="f" gradientshapeok="t" o:connecttype="rect"/>
             <o:lock v:ext="edit" aspectratio="t"/>
           </v:shapetype>
-          <v:shape id="_x0000_i1025" type="#_x0000_t75" style="width:379.35pt;height:392.25pt">
+          <v:shape id="_x0000_i1025" type="#_x0000_t75" style="width:379.5pt;height:391.5pt">
             <v:imagedata r:id="rId9" o:title="Untitled Diagram"/>
           </v:shape>
         </w:pict>
       </w:r>
-      <w:bookmarkStart w:id="0" w:name="_GoBack"/>
-      <w:bookmarkEnd w:id="0"/>
     </w:p>
     <w:p>
       <w:pPr>
@@ -1759,29 +1633,20 @@
     </w:p>
     <w:p>
       <w:pPr>
-        <w:pStyle w:val="ListParagraph"/>
-        <w:numPr>
-          <w:ilvl w:val="1"/>
-          <w:numId w:val="14"/>
-        </w:numPr>
-        <w:rPr>
-          <w:rFonts w:ascii="ae_AlArabiya" w:hAnsi="ae_AlArabiya" w:cs="ae_AlArabiya"/>
-          <w:b/>
-          <w:bCs/>
-          <w:color w:val="595959" w:themeColor="text1" w:themeTint="A6"/>
-          <w:sz w:val="32"/>
-          <w:szCs w:val="32"/>
-          <w:lang w:val="fr-FR"/>
-        </w:rPr>
-      </w:pPr>
-      <w:r>
-        <w:rPr>
-          <w:rFonts w:ascii="ae_AlArabiya" w:hAnsi="ae_AlArabiya" w:cs="ae_AlArabiya"/>
-          <w:b/>
-          <w:bCs/>
-          <w:color w:val="595959" w:themeColor="text1" w:themeTint="A6"/>
-          <w:sz w:val="32"/>
-          <w:szCs w:val="32"/>
+        <w:pStyle w:val="Heading2"/>
+        <w:ind w:firstLine="720"/>
+        <w:rPr>
+          <w:lang w:val="fr-FR"/>
+        </w:rPr>
+      </w:pPr>
+      <w:r>
+        <w:rPr>
+          <w:lang w:val="fr-FR"/>
+        </w:rPr>
+        <w:t xml:space="preserve">2-2 </w:t>
+      </w:r>
+      <w:r>
+        <w:rPr>
           <w:lang w:val="fr-FR"/>
         </w:rPr>
         <w:t>Graphe PERT Probabiliste.</w:t>
@@ -1789,6 +1654,13 @@
     </w:p>
     <w:p>
       <w:pPr>
+        <w:rPr>
+          <w:lang w:val="fr-FR"/>
+        </w:rPr>
+      </w:pPr>
+    </w:p>
+    <w:p>
+      <w:pPr>
         <w:ind w:left="720"/>
         <w:rPr>
           <w:rFonts w:ascii="ae_AlArabiya" w:hAnsi="ae_AlArabiya" w:cs="ae_AlArabiya"/>
@@ -1804,7 +1676,6 @@
           <w:szCs w:val="28"/>
           <w:lang w:val="fr-FR"/>
         </w:rPr>
-        <w:lastRenderedPageBreak/>
         <w:t>Afin de bien identifier les taches du projet, nous avons passé à réaliser le diagramme de PERT</w:t>
       </w:r>
       <w:r>
@@ -1850,29 +1721,22 @@
     </w:p>
     <w:p>
       <w:pPr>
-        <w:pStyle w:val="ListParagraph"/>
-        <w:numPr>
-          <w:ilvl w:val="1"/>
-          <w:numId w:val="14"/>
-        </w:numPr>
-        <w:rPr>
-          <w:rFonts w:ascii="ae_AlArabiya" w:hAnsi="ae_AlArabiya" w:cs="ae_AlArabiya"/>
-          <w:b/>
-          <w:bCs/>
-          <w:color w:val="595959" w:themeColor="text1" w:themeTint="A6"/>
-          <w:sz w:val="32"/>
-          <w:szCs w:val="32"/>
-          <w:lang w:val="fr-FR"/>
-        </w:rPr>
-      </w:pPr>
-      <w:r>
-        <w:rPr>
-          <w:rFonts w:ascii="ae_AlArabiya" w:hAnsi="ae_AlArabiya" w:cs="ae_AlArabiya"/>
-          <w:b/>
-          <w:bCs/>
-          <w:color w:val="595959" w:themeColor="text1" w:themeTint="A6"/>
-          <w:sz w:val="32"/>
-          <w:szCs w:val="32"/>
+        <w:pStyle w:val="Heading2"/>
+        <w:ind w:firstLine="720"/>
+        <w:rPr>
+          <w:lang w:val="fr-FR"/>
+        </w:rPr>
+      </w:pPr>
+      <w:bookmarkStart w:id="0" w:name="_GoBack"/>
+      <w:bookmarkEnd w:id="0"/>
+      <w:r>
+        <w:rPr>
+          <w:lang w:val="fr-FR"/>
+        </w:rPr>
+        <w:t xml:space="preserve">3-3 </w:t>
+      </w:r>
+      <w:r>
+        <w:rPr>
           <w:lang w:val="fr-FR"/>
         </w:rPr>
         <w:t>Estimation des charges.</w:t>
@@ -3165,6 +3029,95 @@
     </w:lvl>
   </w:abstractNum>
   <w:abstractNum w:abstractNumId="12">
+    <w:nsid w:val="656B0C28"/>
+    <w:multiLevelType w:val="hybridMultilevel"/>
+    <w:tmpl w:val="418E42CC"/>
+    <w:lvl w:ilvl="0" w:tplc="F71A60F6">
+      <w:start w:val="1"/>
+      <w:numFmt w:val="decimal"/>
+      <w:lvlText w:val="%1-"/>
+      <w:lvlJc w:val="left"/>
+      <w:pPr>
+        <w:ind w:left="1080" w:hanging="720"/>
+      </w:pPr>
+      <w:rPr>
+        <w:rFonts w:hint="default"/>
+      </w:rPr>
+    </w:lvl>
+    <w:lvl w:ilvl="1" w:tplc="04090019" w:tentative="1">
+      <w:start w:val="1"/>
+      <w:numFmt w:val="lowerLetter"/>
+      <w:lvlText w:val="%2."/>
+      <w:lvlJc w:val="left"/>
+      <w:pPr>
+        <w:ind w:left="1440" w:hanging="360"/>
+      </w:pPr>
+    </w:lvl>
+    <w:lvl w:ilvl="2" w:tplc="0409001B" w:tentative="1">
+      <w:start w:val="1"/>
+      <w:numFmt w:val="lowerRoman"/>
+      <w:lvlText w:val="%3."/>
+      <w:lvlJc w:val="right"/>
+      <w:pPr>
+        <w:ind w:left="2160" w:hanging="180"/>
+      </w:pPr>
+    </w:lvl>
+    <w:lvl w:ilvl="3" w:tplc="0409000F" w:tentative="1">
+      <w:start w:val="1"/>
+      <w:numFmt w:val="decimal"/>
+      <w:lvlText w:val="%4."/>
+      <w:lvlJc w:val="left"/>
+      <w:pPr>
+        <w:ind w:left="2880" w:hanging="360"/>
+      </w:pPr>
+    </w:lvl>
+    <w:lvl w:ilvl="4" w:tplc="04090019" w:tentative="1">
+      <w:start w:val="1"/>
+      <w:numFmt w:val="lowerLetter"/>
+      <w:lvlText w:val="%5."/>
+      <w:lvlJc w:val="left"/>
+      <w:pPr>
+        <w:ind w:left="3600" w:hanging="360"/>
+      </w:pPr>
+    </w:lvl>
+    <w:lvl w:ilvl="5" w:tplc="0409001B" w:tentative="1">
+      <w:start w:val="1"/>
+      <w:numFmt w:val="lowerRoman"/>
+      <w:lvlText w:val="%6."/>
+      <w:lvlJc w:val="right"/>
+      <w:pPr>
+        <w:ind w:left="4320" w:hanging="180"/>
+      </w:pPr>
+    </w:lvl>
+    <w:lvl w:ilvl="6" w:tplc="0409000F" w:tentative="1">
+      <w:start w:val="1"/>
+      <w:numFmt w:val="decimal"/>
+      <w:lvlText w:val="%7."/>
+      <w:lvlJc w:val="left"/>
+      <w:pPr>
+        <w:ind w:left="5040" w:hanging="360"/>
+      </w:pPr>
+    </w:lvl>
+    <w:lvl w:ilvl="7" w:tplc="04090019" w:tentative="1">
+      <w:start w:val="1"/>
+      <w:numFmt w:val="lowerLetter"/>
+      <w:lvlText w:val="%8."/>
+      <w:lvlJc w:val="left"/>
+      <w:pPr>
+        <w:ind w:left="5760" w:hanging="360"/>
+      </w:pPr>
+    </w:lvl>
+    <w:lvl w:ilvl="8" w:tplc="0409001B" w:tentative="1">
+      <w:start w:val="1"/>
+      <w:numFmt w:val="lowerRoman"/>
+      <w:lvlText w:val="%9."/>
+      <w:lvlJc w:val="right"/>
+      <w:pPr>
+        <w:ind w:left="6480" w:hanging="180"/>
+      </w:pPr>
+    </w:lvl>
+  </w:abstractNum>
+  <w:abstractNum w:abstractNumId="13">
     <w:nsid w:val="67B67279"/>
     <w:multiLevelType w:val="hybridMultilevel"/>
     <w:tmpl w:val="DBB4103A"/>
@@ -3277,7 +3230,96 @@
       </w:rPr>
     </w:lvl>
   </w:abstractNum>
-  <w:abstractNum w:abstractNumId="13">
+  <w:abstractNum w:abstractNumId="14">
+    <w:nsid w:val="6FF67DA5"/>
+    <w:multiLevelType w:val="hybridMultilevel"/>
+    <w:tmpl w:val="9EB2AD88"/>
+    <w:lvl w:ilvl="0" w:tplc="0B007CEA">
+      <w:start w:val="1"/>
+      <w:numFmt w:val="decimal"/>
+      <w:lvlText w:val="%1-"/>
+      <w:lvlJc w:val="left"/>
+      <w:pPr>
+        <w:ind w:left="1080" w:hanging="720"/>
+      </w:pPr>
+      <w:rPr>
+        <w:rFonts w:hint="default"/>
+      </w:rPr>
+    </w:lvl>
+    <w:lvl w:ilvl="1" w:tplc="04090019" w:tentative="1">
+      <w:start w:val="1"/>
+      <w:numFmt w:val="lowerLetter"/>
+      <w:lvlText w:val="%2."/>
+      <w:lvlJc w:val="left"/>
+      <w:pPr>
+        <w:ind w:left="1440" w:hanging="360"/>
+      </w:pPr>
+    </w:lvl>
+    <w:lvl w:ilvl="2" w:tplc="0409001B" w:tentative="1">
+      <w:start w:val="1"/>
+      <w:numFmt w:val="lowerRoman"/>
+      <w:lvlText w:val="%3."/>
+      <w:lvlJc w:val="right"/>
+      <w:pPr>
+        <w:ind w:left="2160" w:hanging="180"/>
+      </w:pPr>
+    </w:lvl>
+    <w:lvl w:ilvl="3" w:tplc="0409000F" w:tentative="1">
+      <w:start w:val="1"/>
+      <w:numFmt w:val="decimal"/>
+      <w:lvlText w:val="%4."/>
+      <w:lvlJc w:val="left"/>
+      <w:pPr>
+        <w:ind w:left="2880" w:hanging="360"/>
+      </w:pPr>
+    </w:lvl>
+    <w:lvl w:ilvl="4" w:tplc="04090019" w:tentative="1">
+      <w:start w:val="1"/>
+      <w:numFmt w:val="lowerLetter"/>
+      <w:lvlText w:val="%5."/>
+      <w:lvlJc w:val="left"/>
+      <w:pPr>
+        <w:ind w:left="3600" w:hanging="360"/>
+      </w:pPr>
+    </w:lvl>
+    <w:lvl w:ilvl="5" w:tplc="0409001B" w:tentative="1">
+      <w:start w:val="1"/>
+      <w:numFmt w:val="lowerRoman"/>
+      <w:lvlText w:val="%6."/>
+      <w:lvlJc w:val="right"/>
+      <w:pPr>
+        <w:ind w:left="4320" w:hanging="180"/>
+      </w:pPr>
+    </w:lvl>
+    <w:lvl w:ilvl="6" w:tplc="0409000F" w:tentative="1">
+      <w:start w:val="1"/>
+      <w:numFmt w:val="decimal"/>
+      <w:lvlText w:val="%7."/>
+      <w:lvlJc w:val="left"/>
+      <w:pPr>
+        <w:ind w:left="5040" w:hanging="360"/>
+      </w:pPr>
+    </w:lvl>
+    <w:lvl w:ilvl="7" w:tplc="04090019" w:tentative="1">
+      <w:start w:val="1"/>
+      <w:numFmt w:val="lowerLetter"/>
+      <w:lvlText w:val="%8."/>
+      <w:lvlJc w:val="left"/>
+      <w:pPr>
+        <w:ind w:left="5760" w:hanging="360"/>
+      </w:pPr>
+    </w:lvl>
+    <w:lvl w:ilvl="8" w:tplc="0409001B" w:tentative="1">
+      <w:start w:val="1"/>
+      <w:numFmt w:val="lowerRoman"/>
+      <w:lvlText w:val="%9."/>
+      <w:lvlJc w:val="right"/>
+      <w:pPr>
+        <w:ind w:left="6480" w:hanging="180"/>
+      </w:pPr>
+    </w:lvl>
+  </w:abstractNum>
+  <w:abstractNum w:abstractNumId="15">
     <w:nsid w:val="729F2011"/>
     <w:multiLevelType w:val="hybridMultilevel"/>
     <w:tmpl w:val="A9D025F8"/>
@@ -3400,7 +3442,7 @@
     <w:abstractNumId w:val="10"/>
   </w:num>
   <w:num w:numId="4">
-    <w:abstractNumId w:val="12"/>
+    <w:abstractNumId w:val="13"/>
   </w:num>
   <w:num w:numId="5">
     <w:abstractNumId w:val="0"/>
@@ -3412,7 +3454,7 @@
     <w:abstractNumId w:val="1"/>
   </w:num>
   <w:num w:numId="8">
-    <w:abstractNumId w:val="13"/>
+    <w:abstractNumId w:val="15"/>
   </w:num>
   <w:num w:numId="9">
     <w:abstractNumId w:val="6"/>
@@ -3431,6 +3473,12 @@
   </w:num>
   <w:num w:numId="14">
     <w:abstractNumId w:val="11"/>
+  </w:num>
+  <w:num w:numId="15">
+    <w:abstractNumId w:val="12"/>
+  </w:num>
+  <w:num w:numId="16">
+    <w:abstractNumId w:val="14"/>
   </w:num>
 </w:numbering>
 </file>
@@ -3829,6 +3877,74 @@
     <w:name w:val="Normal"/>
     <w:qFormat/>
   </w:style>
+  <w:style w:type="paragraph" w:styleId="Heading1">
+    <w:name w:val="heading 1"/>
+    <w:basedOn w:val="Normal"/>
+    <w:next w:val="Normal"/>
+    <w:link w:val="Heading1Char"/>
+    <w:uiPriority w:val="9"/>
+    <w:qFormat/>
+    <w:rsid w:val="00943505"/>
+    <w:pPr>
+      <w:keepNext/>
+      <w:keepLines/>
+      <w:spacing w:before="240" w:after="0"/>
+      <w:outlineLvl w:val="0"/>
+    </w:pPr>
+    <w:rPr>
+      <w:rFonts w:ascii="Segoe UI" w:eastAsiaTheme="majorEastAsia" w:hAnsi="Segoe UI" w:cstheme="majorBidi"/>
+      <w:b/>
+      <w:color w:val="2E74B5" w:themeColor="accent1" w:themeShade="BF"/>
+      <w:sz w:val="48"/>
+      <w:szCs w:val="32"/>
+    </w:rPr>
+  </w:style>
+  <w:style w:type="paragraph" w:styleId="Heading2">
+    <w:name w:val="heading 2"/>
+    <w:basedOn w:val="Normal"/>
+    <w:next w:val="Normal"/>
+    <w:link w:val="Heading2Char"/>
+    <w:uiPriority w:val="9"/>
+    <w:unhideWhenUsed/>
+    <w:qFormat/>
+    <w:rsid w:val="00943505"/>
+    <w:pPr>
+      <w:keepNext/>
+      <w:keepLines/>
+      <w:spacing w:before="40" w:after="0"/>
+      <w:outlineLvl w:val="1"/>
+    </w:pPr>
+    <w:rPr>
+      <w:rFonts w:ascii="Segoe UI" w:eastAsiaTheme="majorEastAsia" w:hAnsi="Segoe UI" w:cstheme="majorBidi"/>
+      <w:b/>
+      <w:color w:val="404040" w:themeColor="text1" w:themeTint="BF"/>
+      <w:sz w:val="36"/>
+      <w:szCs w:val="26"/>
+    </w:rPr>
+  </w:style>
+  <w:style w:type="paragraph" w:styleId="Heading3">
+    <w:name w:val="heading 3"/>
+    <w:basedOn w:val="Normal"/>
+    <w:next w:val="Normal"/>
+    <w:link w:val="Heading3Char"/>
+    <w:uiPriority w:val="9"/>
+    <w:unhideWhenUsed/>
+    <w:qFormat/>
+    <w:rsid w:val="00943505"/>
+    <w:pPr>
+      <w:keepNext/>
+      <w:keepLines/>
+      <w:spacing w:before="40" w:after="0"/>
+      <w:outlineLvl w:val="2"/>
+    </w:pPr>
+    <w:rPr>
+      <w:rFonts w:ascii="Segoe UI" w:eastAsiaTheme="majorEastAsia" w:hAnsi="Segoe UI" w:cstheme="majorBidi"/>
+      <w:b/>
+      <w:color w:val="FF0000"/>
+      <w:sz w:val="44"/>
+      <w:szCs w:val="24"/>
+    </w:rPr>
+  </w:style>
   <w:style w:type="character" w:default="1" w:styleId="DefaultParagraphFont">
     <w:name w:val="Default Paragraph Font"/>
     <w:uiPriority w:val="1"/>
@@ -3932,6 +4048,48 @@
     <w:rsid w:val="00B601E0"/>
     <w:rPr>
       <w:rFonts w:eastAsiaTheme="minorEastAsia"/>
+    </w:rPr>
+  </w:style>
+  <w:style w:type="character" w:customStyle="1" w:styleId="Heading1Char">
+    <w:name w:val="Heading 1 Char"/>
+    <w:basedOn w:val="DefaultParagraphFont"/>
+    <w:link w:val="Heading1"/>
+    <w:uiPriority w:val="9"/>
+    <w:rsid w:val="00943505"/>
+    <w:rPr>
+      <w:rFonts w:ascii="Segoe UI" w:eastAsiaTheme="majorEastAsia" w:hAnsi="Segoe UI" w:cstheme="majorBidi"/>
+      <w:b/>
+      <w:color w:val="2E74B5" w:themeColor="accent1" w:themeShade="BF"/>
+      <w:sz w:val="48"/>
+      <w:szCs w:val="32"/>
+    </w:rPr>
+  </w:style>
+  <w:style w:type="character" w:customStyle="1" w:styleId="Heading2Char">
+    <w:name w:val="Heading 2 Char"/>
+    <w:basedOn w:val="DefaultParagraphFont"/>
+    <w:link w:val="Heading2"/>
+    <w:uiPriority w:val="9"/>
+    <w:rsid w:val="00943505"/>
+    <w:rPr>
+      <w:rFonts w:ascii="Segoe UI" w:eastAsiaTheme="majorEastAsia" w:hAnsi="Segoe UI" w:cstheme="majorBidi"/>
+      <w:b/>
+      <w:color w:val="404040" w:themeColor="text1" w:themeTint="BF"/>
+      <w:sz w:val="36"/>
+      <w:szCs w:val="26"/>
+    </w:rPr>
+  </w:style>
+  <w:style w:type="character" w:customStyle="1" w:styleId="Heading3Char">
+    <w:name w:val="Heading 3 Char"/>
+    <w:basedOn w:val="DefaultParagraphFont"/>
+    <w:link w:val="Heading3"/>
+    <w:uiPriority w:val="9"/>
+    <w:rsid w:val="00943505"/>
+    <w:rPr>
+      <w:rFonts w:ascii="Segoe UI" w:eastAsiaTheme="majorEastAsia" w:hAnsi="Segoe UI" w:cstheme="majorBidi"/>
+      <w:b/>
+      <w:color w:val="FF0000"/>
+      <w:sz w:val="44"/>
+      <w:szCs w:val="24"/>
     </w:rPr>
   </w:style>
 </w:styles>
@@ -4203,7 +4361,7 @@
 </file>
 
 <file path=customXml/itemProps1.xml><?xml version="1.0" encoding="utf-8"?>
-<ds:datastoreItem xmlns:ds="http://schemas.openxmlformats.org/officeDocument/2006/customXml" ds:itemID="{125A67D9-21F7-49E2-8F19-D7B2B1774324}">
+<ds:datastoreItem xmlns:ds="http://schemas.openxmlformats.org/officeDocument/2006/customXml" ds:itemID="{7547E030-FF4D-421E-B7D7-E6A23EB6EF08}">
   <ds:schemaRefs>
     <ds:schemaRef ds:uri="http://schemas.openxmlformats.org/officeDocument/2006/bibliography"/>
   </ds:schemaRefs>

</xml_diff>